<commit_message>
Volume 1, Chapter 4: project-setup steps (every project created by its own tools)
</commit_message>
<xml_diff>
--- a/Volume 1/Chapter 04 - Databases/SPA_Vol1_Ch4_Lesson4_0_MySQL_Setup.docx
+++ b/Volume 1/Chapter 04 - Databases/SPA_Vol1_Ch4_Lesson4_0_MySQL_Setup.docx
@@ -1853,9 +1853,353 @@
     </w:p>
     <w:p>
       <w:pPr>
+        <w:keepNext/>
+      </w:pPr>
+      <w:r>
+        <w:t xml:space="preserve">Next, let the tools create each project's settings file, as in Chapter 1 and Lesson 2.17. Remember, dotnet new console -o makes a C# project in the folder -o names, with a .csproj file and a Program.cs. The starter Program.cs only prints Hello, World!; you replace it with this lesson's code in the C# section. Remember, dotnet add package writes the pinned PackageReference into the .csproj, and the package is downloaded into your NuGet cache: here MySqlConnector 2.6.2, once for each C# project. Remember, go </w:t>
+      </w:r>
+      <w:r>
+        <w:t>mod init makes the .\go folder a module by writing .\go\go.mod, and go get pins the module in go.mod and go.sum: here the MySQL driver at v1.10.1. The go line shows the Go version you have installed. No .go file imports the driver yet, so go get marks it // indirect; the build works either way.</w:t>
+      </w:r>
+    </w:p>
+    <w:p>
+      <w:pPr>
+        <w:keepNext/>
+      </w:pPr>
+    </w:p>
+    <w:p>
+      <w:pPr>
+        <w:pStyle w:val="CommandBlock"/>
+        <w:keepNext/>
+      </w:pPr>
+      <w:r>
+        <w:t>dotnet new console -o .\csharp\BasicSetupCheck</w:t>
+      </w:r>
+    </w:p>
+    <w:p>
+      <w:pPr>
+        <w:pStyle w:val="CommandBlock"/>
+        <w:keepNext/>
+      </w:pPr>
+      <w:r>
+        <w:t>dotnet new console -o .\csharp\SetupCheck</w:t>
+      </w:r>
+    </w:p>
+    <w:p>
+      <w:pPr>
+        <w:pStyle w:val="CommandBlock"/>
+        <w:keepNext/>
+      </w:pPr>
+      <w:r>
+        <w:t>dotnet add .\csharp\BasicSetupCheck package MySqlConnector --version 2.6.2</w:t>
+      </w:r>
+    </w:p>
+    <w:p>
+      <w:pPr>
+        <w:pStyle w:val="CommandBlock"/>
+        <w:keepNext/>
+      </w:pPr>
+      <w:r>
+        <w:t>dotnet add .\csharp\SetupCheck package MySqlConnector --version 2.6.2</w:t>
+      </w:r>
+    </w:p>
+    <w:p>
+      <w:pPr>
+        <w:pStyle w:val="CommandBlock"/>
+        <w:keepNext/>
+      </w:pPr>
+      <w:r>
+        <w:t>go -C .\go mod init example.com/setupcheck</w:t>
+      </w:r>
+    </w:p>
+    <w:p>
+      <w:pPr>
+        <w:pStyle w:val="CommandBlock"/>
+      </w:pPr>
+      <w:r>
+        <w:t>go -C .\go get github.com/go-sql-driver/mysql@v1.10.1</w:t>
+      </w:r>
+    </w:p>
+    <w:p>
+      <w:pPr>
+        <w:keepNext/>
+      </w:pPr>
+    </w:p>
+    <w:p>
+      <w:pPr>
+        <w:keepNext/>
+      </w:pPr>
+      <w:r>
+        <w:t>Remember, npm init -y makes package.json inside .\typescript, npm pkg set and npm pkg delete shape its fields, and npm install pins the compiler. The last npm line pins mysql2 3.24.5, the MySQL connector the TypeScript programs use, under dependencies; --save-dev keeps the compiler under devDependencies, because only the build needs it.</w:t>
+      </w:r>
+    </w:p>
+    <w:p>
+      <w:pPr>
+        <w:keepNext/>
+      </w:pPr>
+    </w:p>
+    <w:p>
+      <w:pPr>
+        <w:pStyle w:val="CommandBlock"/>
+        <w:keepNext/>
+      </w:pPr>
+      <w:r>
+        <w:t>Push-Location .\typescript</w:t>
+      </w:r>
+    </w:p>
+    <w:p>
+      <w:pPr>
+        <w:pStyle w:val="CommandBlock"/>
+        <w:keepNext/>
+      </w:pPr>
+      <w:r>
+        <w:t>npm init -y</w:t>
+      </w:r>
+    </w:p>
+    <w:p>
+      <w:pPr>
+        <w:pStyle w:val="CommandBlock"/>
+        <w:keepNext/>
+      </w:pPr>
+      <w:r>
+        <w:t>npm pkg set name=setup-check-typescript type=module</w:t>
+      </w:r>
+    </w:p>
+    <w:p>
+      <w:pPr>
+        <w:pStyle w:val="CommandBlock"/>
+        <w:keepNext/>
+      </w:pPr>
+      <w:r>
+        <w:t>npm pkg set private=true --json</w:t>
+      </w:r>
+    </w:p>
+    <w:p>
+      <w:pPr>
+        <w:pStyle w:val="CommandBlock"/>
+        <w:keepNext/>
+      </w:pPr>
+      <w:r>
+        <w:t>npm pkg set "scripts.check=tsc --noEmit" "scripts.build=tsc --noEmitOnError"</w:t>
+      </w:r>
+    </w:p>
+    <w:p>
+      <w:pPr>
+        <w:pStyle w:val="CommandBlock"/>
+        <w:keepNext/>
+      </w:pPr>
+      <w:r>
+        <w:t>npm pkg delete version description main keywords author license scripts.test</w:t>
+      </w:r>
+    </w:p>
+    <w:p>
+      <w:pPr>
+        <w:pStyle w:val="CommandBlock"/>
+        <w:keepNext/>
+      </w:pPr>
+      <w:r>
+        <w:t>npm install --save-dev --save-exact typescript@7.0.2 @types/node@24.13.5 `</w:t>
+      </w:r>
+    </w:p>
+    <w:p>
+      <w:pPr>
+        <w:pStyle w:val="CommandBlock"/>
+        <w:keepNext/>
+      </w:pPr>
+      <w:r>
+        <w:t xml:space="preserve">    --ignore-scripts --no-audit --no-fund</w:t>
+      </w:r>
+    </w:p>
+    <w:p>
+      <w:pPr>
+        <w:pStyle w:val="CommandBlock"/>
+        <w:keepNext/>
+      </w:pPr>
+      <w:r>
+        <w:t>npm install --save-exact mysql2@3.24.5 --ignore-scripts --no-audit --no-fund</w:t>
+      </w:r>
+    </w:p>
+    <w:p>
+      <w:pPr>
+        <w:pStyle w:val="CommandBlock"/>
+      </w:pPr>
+      <w:r>
+        <w:t>Pop-Location</w:t>
+      </w:r>
+    </w:p>
+    <w:p>
+      <w:pPr>
+        <w:keepNext/>
+      </w:pPr>
+    </w:p>
+    <w:p>
+      <w:r>
+        <w:t>Then type the TypeScript compiler settings. As in Chapter 1, notepad .\typescript\tsconfig.json creates and opens the file: choose Yes, type the file, save it with Ctrl+S, and close Notepad.</w:t>
+      </w:r>
+    </w:p>
+    <w:p>
+      <w:pPr>
+        <w:keepNext/>
+      </w:pPr>
+    </w:p>
+    <w:p>
+      <w:pPr>
         <w:pStyle w:val="Heading3"/>
       </w:pPr>
       <w:r>
+        <w:t>typescript/tsconfig.json</w:t>
+      </w:r>
+    </w:p>
+    <w:p>
+      <w:pPr>
+        <w:pStyle w:val="SourceCode"/>
+        <w:keepNext/>
+      </w:pPr>
+      <w:r>
+        <w:t>{</w:t>
+      </w:r>
+    </w:p>
+    <w:p>
+      <w:pPr>
+        <w:pStyle w:val="SourceCode"/>
+        <w:keepNext/>
+      </w:pPr>
+      <w:r>
+        <w:t xml:space="preserve">  "compilerOptions": {</w:t>
+      </w:r>
+    </w:p>
+    <w:p>
+      <w:pPr>
+        <w:pStyle w:val="SourceCode"/>
+      </w:pPr>
+      <w:r>
+        <w:t xml:space="preserve">    "target": "ES2022",</w:t>
+      </w:r>
+    </w:p>
+    <w:p>
+      <w:pPr>
+        <w:pStyle w:val="SourceCode"/>
+      </w:pPr>
+      <w:r>
+        <w:t xml:space="preserve">    "module": "NodeNext",</w:t>
+      </w:r>
+    </w:p>
+    <w:p>
+      <w:pPr>
+        <w:pStyle w:val="SourceCode"/>
+      </w:pPr>
+      <w:r>
+        <w:t xml:space="preserve">    "moduleResolution": "NodeNext",</w:t>
+      </w:r>
+    </w:p>
+    <w:p>
+      <w:pPr>
+        <w:pStyle w:val="SourceCode"/>
+      </w:pPr>
+      <w:r>
+        <w:t xml:space="preserve">    "rootDir": "src",</w:t>
+      </w:r>
+    </w:p>
+    <w:p>
+      <w:pPr>
+        <w:pStyle w:val="SourceCode"/>
+      </w:pPr>
+      <w:r>
+        <w:t xml:space="preserve">    "outDir": "dist",</w:t>
+      </w:r>
+    </w:p>
+    <w:p>
+      <w:pPr>
+        <w:pStyle w:val="SourceCode"/>
+      </w:pPr>
+      <w:r>
+        <w:t xml:space="preserve">    "strict": true,</w:t>
+      </w:r>
+    </w:p>
+    <w:p>
+      <w:pPr>
+        <w:pStyle w:val="SourceCode"/>
+      </w:pPr>
+      <w:r>
+        <w:t xml:space="preserve">    "types": [</w:t>
+      </w:r>
+    </w:p>
+    <w:p>
+      <w:pPr>
+        <w:pStyle w:val="SourceCode"/>
+      </w:pPr>
+      <w:r>
+        <w:t xml:space="preserve">      "node"</w:t>
+      </w:r>
+    </w:p>
+    <w:p>
+      <w:pPr>
+        <w:pStyle w:val="SourceCode"/>
+      </w:pPr>
+      <w:r>
+        <w:t xml:space="preserve">    ],</w:t>
+      </w:r>
+    </w:p>
+    <w:p>
+      <w:pPr>
+        <w:pStyle w:val="SourceCode"/>
+      </w:pPr>
+      <w:r>
+        <w:t xml:space="preserve">    "moduleDetection": "force"</w:t>
+      </w:r>
+    </w:p>
+    <w:p>
+      <w:pPr>
+        <w:pStyle w:val="SourceCode"/>
+      </w:pPr>
+      <w:r>
+        <w:t xml:space="preserve">  },</w:t>
+      </w:r>
+    </w:p>
+    <w:p>
+      <w:pPr>
+        <w:pStyle w:val="SourceCode"/>
+      </w:pPr>
+      <w:r>
+        <w:t xml:space="preserve">  "include": [</w:t>
+      </w:r>
+    </w:p>
+    <w:p>
+      <w:pPr>
+        <w:pStyle w:val="SourceCode"/>
+        <w:keepNext/>
+      </w:pPr>
+      <w:r>
+        <w:t xml:space="preserve">    "src/**/*.ts"</w:t>
+      </w:r>
+    </w:p>
+    <w:p>
+      <w:pPr>
+        <w:pStyle w:val="SourceCode"/>
+        <w:keepNext/>
+      </w:pPr>
+      <w:r>
+        <w:t xml:space="preserve">  ]</w:t>
+      </w:r>
+    </w:p>
+    <w:p>
+      <w:pPr>
+        <w:pStyle w:val="SourceCode"/>
+      </w:pPr>
+      <w:r>
+        <w:t>}</w:t>
+      </w:r>
+    </w:p>
+    <w:p>
+      <w:pPr>
+        <w:keepNext/>
+      </w:pPr>
+    </w:p>
+    <w:p>
+      <w:pPr>
+        <w:pStyle w:val="Heading3"/>
+      </w:pPr>
+      <w:r>
         <w:t>Linux or macOS Project Setup</w:t>
       </w:r>
     </w:p>
@@ -1904,11 +2248,168 @@
       </w:pPr>
     </w:p>
     <w:p>
-      <w:r>
-        <w:t>Save each source and supporting file from this lesson into the matching path in the project layout. As in Chapter 1, notepad .\c\basic_setup_check.c creates and opens one: choose Yes, type the file, save it with Ctrl+S, and close Notepad (on Linux or macOS, nano ./c/basic_setup_check.c: type the file, then save and close it with Ctrl+O, Enter, then Ctrl+X). Save them all before step 7: go mod tidy keeps a requirement only when a saved .go file imports it, so running it before the .go files exist would remov</w:t>
-      </w:r>
-      <w:r>
-        <w:t>e the driver from go.mod.</w:t>
+      <w:pPr>
+        <w:keepNext/>
+      </w:pPr>
+      <w:r>
+        <w:t>Then create the C#, Go, and TypeScript project files with the same commands as on Windows; cd moves into ./typescript for the npm lines, and cd .. moves back.</w:t>
+      </w:r>
+    </w:p>
+    <w:p>
+      <w:pPr>
+        <w:keepNext/>
+      </w:pPr>
+    </w:p>
+    <w:p>
+      <w:pPr>
+        <w:pStyle w:val="CommandBlock"/>
+        <w:keepNext/>
+      </w:pPr>
+      <w:r>
+        <w:t>dotnet new console -o ./csharp/BasicSetupCheck</w:t>
+      </w:r>
+    </w:p>
+    <w:p>
+      <w:pPr>
+        <w:pStyle w:val="CommandBlock"/>
+        <w:keepNext/>
+      </w:pPr>
+      <w:r>
+        <w:t>dotnet new console -o ./csharp/SetupCheck</w:t>
+      </w:r>
+    </w:p>
+    <w:p>
+      <w:pPr>
+        <w:pStyle w:val="CommandBlock"/>
+      </w:pPr>
+      <w:r>
+        <w:t>dotnet add ./csharp/BasicSetupCheck package MySqlConnector --version 2.6.2</w:t>
+      </w:r>
+    </w:p>
+    <w:p>
+      <w:pPr>
+        <w:pStyle w:val="CommandBlock"/>
+      </w:pPr>
+      <w:r>
+        <w:t>dotnet add ./csharp/SetupCheck package MySqlConnector --version 2.6.2</w:t>
+      </w:r>
+    </w:p>
+    <w:p>
+      <w:pPr>
+        <w:pStyle w:val="CommandBlock"/>
+      </w:pPr>
+      <w:r>
+        <w:t>go -C ./go mod init example.com/setupcheck</w:t>
+      </w:r>
+    </w:p>
+    <w:p>
+      <w:pPr>
+        <w:pStyle w:val="CommandBlock"/>
+      </w:pPr>
+      <w:r>
+        <w:t>go -C ./go get github.com/go-sql-driver/mysql@v1.10.1</w:t>
+      </w:r>
+    </w:p>
+    <w:p>
+      <w:pPr>
+        <w:pStyle w:val="CommandBlock"/>
+      </w:pPr>
+      <w:r>
+        <w:t>cd ./typescript</w:t>
+      </w:r>
+    </w:p>
+    <w:p>
+      <w:pPr>
+        <w:pStyle w:val="CommandBlock"/>
+      </w:pPr>
+      <w:r>
+        <w:t>npm init -y</w:t>
+      </w:r>
+    </w:p>
+    <w:p>
+      <w:pPr>
+        <w:pStyle w:val="CommandBlock"/>
+      </w:pPr>
+      <w:r>
+        <w:t>npm pkg set name=setup-check-typescript type=module</w:t>
+      </w:r>
+    </w:p>
+    <w:p>
+      <w:pPr>
+        <w:pStyle w:val="CommandBlock"/>
+      </w:pPr>
+      <w:r>
+        <w:t>npm pkg set private=true --json</w:t>
+      </w:r>
+    </w:p>
+    <w:p>
+      <w:pPr>
+        <w:pStyle w:val="CommandBlock"/>
+      </w:pPr>
+      <w:r>
+        <w:t>npm pkg set "scripts.check=tsc --noEmit" "scripts.build=tsc --noEmitOnError"</w:t>
+      </w:r>
+    </w:p>
+    <w:p>
+      <w:pPr>
+        <w:pStyle w:val="CommandBlock"/>
+      </w:pPr>
+      <w:r>
+        <w:t>npm pkg delete version description main keywords author license scripts.test</w:t>
+      </w:r>
+    </w:p>
+    <w:p>
+      <w:pPr>
+        <w:pStyle w:val="CommandBlock"/>
+      </w:pPr>
+      <w:r>
+        <w:t>npm install --save-dev --save-exact typescript@7.0.2 @types/node@24.13.5 \</w:t>
+      </w:r>
+    </w:p>
+    <w:p>
+      <w:pPr>
+        <w:pStyle w:val="CommandBlock"/>
+        <w:keepNext/>
+      </w:pPr>
+      <w:r>
+        <w:t xml:space="preserve">    --ignore-scripts --no-audit --no-fund</w:t>
+      </w:r>
+    </w:p>
+    <w:p>
+      <w:pPr>
+        <w:pStyle w:val="CommandBlock"/>
+        <w:keepNext/>
+      </w:pPr>
+      <w:r>
+        <w:t>npm install --save-exact mysql2@3.24.5 --ignore-scripts --no-audit --no-fund</w:t>
+      </w:r>
+    </w:p>
+    <w:p>
+      <w:pPr>
+        <w:pStyle w:val="CommandBlock"/>
+      </w:pPr>
+      <w:r>
+        <w:t>cd ..</w:t>
+      </w:r>
+    </w:p>
+    <w:p>
+      <w:pPr>
+        <w:keepNext/>
+      </w:pPr>
+    </w:p>
+    <w:p>
+      <w:r>
+        <w:t>Type typescript/tsconfig.json exactly as shown in the Windows setup.</w:t>
+      </w:r>
+    </w:p>
+    <w:p>
+      <w:pPr>
+        <w:keepNext/>
+      </w:pPr>
+    </w:p>
+    <w:p>
+      <w:r>
+        <w:t>You save each source file in its language's section below, as each is shown. As in Chapter 1, notepad .\c\basic_setup_check.c creates and opens one: choose Yes, type the file, save it with Ctrl+S, and close Notepad (on Linux or macOS, nano ./c/basic_setup_check.c: type the file, then save and close it with Ctrl+O, Enter, then Ctrl+X).</w:t>
       </w:r>
     </w:p>
     <w:p>
@@ -1931,10 +2432,7 @@
     </w:p>
     <w:p>
       <w:r>
-        <w:t>Install each language's connector into the lesson folder only; nothing here is installed for the whole computer. Remember, each command downloads the pinned version its project file or command names (Lesson 2.17). npm installs mysql2 and the TypeScript compiler from package.json. py -m venv creates .\python\.venv, and its own Python's pip installs mysql-connector-python==26.7.0 into it. go mod tidy downloads the driver go.mod requires and records its checksums in go.sum. dotnet restore downloads MySqlConnec</w:t>
-      </w:r>
-      <w:r>
-        <w:t>tor for each C# project; dotnet build would also do it the first time.</w:t>
+        <w:t>Install each language's connector into the lesson folder only; nothing here is installed for the whole computer. Remember, each command downloads the pinned version its project file or command names (Lesson 2.17). py -m venv creates .\python\.venv, and its own Python's pip installs mysql-connector-python==26.7.0 into it. dotnet restore checks that MySqlConnector, which dotnet add already downloaded, is in place for each C# project; dotnet build would also do it the first time.</w:t>
       </w:r>
     </w:p>
     <w:p>
@@ -1956,7 +2454,7 @@
         <w:keepNext/>
       </w:pPr>
       <w:r>
-        <w:t>npm --prefix .\typescript install --ignore-scripts --no-audit --no-fund</w:t>
+        <w:t>py -m venv .\python\.venv</w:t>
       </w:r>
     </w:p>
     <w:p>
@@ -1965,7 +2463,7 @@
         <w:keepNext/>
       </w:pPr>
       <w:r>
-        <w:t>py -m venv .\python\.venv</w:t>
+        <w:t>.\python\.venv\Scripts\python.exe -m pip install mysql-connector-python==26.7.0</w:t>
       </w:r>
     </w:p>
     <w:p>
@@ -1974,16 +2472,38 @@
         <w:keepNext/>
       </w:pPr>
       <w:r>
-        <w:t>.\python\.venv\Scripts\python.exe -m pip install mysql-connector-python==26.7.0</w:t>
+        <w:t>dotnet restore .\csharp\BasicSetupCheck</w:t>
       </w:r>
     </w:p>
     <w:p>
       <w:pPr>
         <w:pStyle w:val="CommandBlock"/>
-        <w:keepNext/>
-      </w:pPr>
-      <w:r>
-        <w:t>go -C .\go mod tidy</w:t>
+      </w:pPr>
+      <w:r>
+        <w:t>dotnet restore .\csharp\SetupCheck</w:t>
+      </w:r>
+    </w:p>
+    <w:p>
+      <w:pPr>
+        <w:keepNext/>
+      </w:pPr>
+    </w:p>
+    <w:p>
+      <w:r>
+        <w:t>C and C++ use the libraries from steps 1 and 5. Copy their DLLs into the c and cpp folders, next to the programs that will use them. $server and $connector hold the two install folders, and the ` at the end of a line continues the command on the next line.</w:t>
+      </w:r>
+    </w:p>
+    <w:p>
+      <w:pPr>
+        <w:keepNext/>
+      </w:pPr>
+    </w:p>
+    <w:p>
+      <w:pPr>
+        <w:pStyle w:val="Heading3"/>
+      </w:pPr>
+      <w:r>
+        <w:t>Windows PowerShell Library Setup</w:t>
       </w:r>
     </w:p>
     <w:p>
@@ -1992,25 +2512,60 @@
         <w:keepNext/>
       </w:pPr>
       <w:r>
-        <w:t>dotnet restore .\csharp\BasicSetupCheck</w:t>
+        <w:t>$server = "C:\Program Files\MySQL\MySQL Server 26.7"</w:t>
       </w:r>
     </w:p>
     <w:p>
       <w:pPr>
         <w:pStyle w:val="CommandBlock"/>
-      </w:pPr>
-      <w:r>
-        <w:t>dotnet restore .\csharp\SetupCheck</w:t>
-      </w:r>
-    </w:p>
-    <w:p>
-      <w:pPr>
-        <w:keepNext/>
-      </w:pPr>
-    </w:p>
-    <w:p>
-      <w:r>
-        <w:t>C and C++ use the libraries from steps 1 and 5. Copy their DLLs into the c and cpp folders, next to the programs that will use them. $server and $connector hold the two install folders, and the ` at the end of a line continues the command on the next line.</w:t>
+        <w:keepNext/>
+      </w:pPr>
+      <w:r>
+        <w:t>Copy-Item "$server\lib\libmysql.dll", "$server\bin\libssl-3-x64.dll", `</w:t>
+      </w:r>
+    </w:p>
+    <w:p>
+      <w:pPr>
+        <w:pStyle w:val="CommandBlock"/>
+        <w:keepNext/>
+      </w:pPr>
+      <w:r>
+        <w:t xml:space="preserve">    "$server\bin\libcrypto-3-x64.dll" .\c</w:t>
+      </w:r>
+    </w:p>
+    <w:p>
+      <w:pPr>
+        <w:pStyle w:val="CommandBlock"/>
+        <w:keepNext/>
+      </w:pPr>
+      <w:r>
+        <w:t>$connector = "C:\Program Files\MySQL\MySQL Connector C++ 26.7"</w:t>
+      </w:r>
+    </w:p>
+    <w:p>
+      <w:pPr>
+        <w:pStyle w:val="CommandBlock"/>
+        <w:keepNext/>
+      </w:pPr>
+      <w:r>
+        <w:t>Copy-Item "$connector\lib64\mysqlcppconn-10-vs14.dll", `</w:t>
+      </w:r>
+    </w:p>
+    <w:p>
+      <w:pPr>
+        <w:pStyle w:val="CommandBlock"/>
+        <w:keepNext/>
+      </w:pPr>
+      <w:r>
+        <w:t xml:space="preserve">    "$connector\lib64\libssl-3-x64.dll", `</w:t>
+      </w:r>
+    </w:p>
+    <w:p>
+      <w:pPr>
+        <w:pStyle w:val="CommandBlock"/>
+      </w:pPr>
+      <w:r>
+        <w:t xml:space="preserve">    "$connector\lib64\libcrypto-3-x64.dll" .\cpp</w:t>
       </w:r>
     </w:p>
     <w:p>
@@ -2023,7 +2578,7 @@
         <w:pStyle w:val="Heading3"/>
       </w:pPr>
       <w:r>
-        <w:t>Windows PowerShell Library Setup</w:t>
+        <w:t>Windows PowerShell Library Check</w:t>
       </w:r>
     </w:p>
     <w:p>
@@ -2032,17 +2587,100 @@
         <w:keepNext/>
       </w:pPr>
       <w:r>
-        <w:t>$server = "C:\Program Files\MySQL\MySQL Server 26.7"</w:t>
+        <w:t>Get-ChildItem .\c -Filter *.dll -Name</w:t>
       </w:r>
     </w:p>
     <w:p>
       <w:pPr>
         <w:pStyle w:val="CommandBlock"/>
-        <w:keepNext/>
-      </w:pPr>
-      <w:r>
-        <w:t>Copy-Item "$server\lib\libmysql.dll", "$server\bin\libssl-3-x64.dll", `</w:t>
-      </w:r>
+      </w:pPr>
+      <w:r>
+        <w:t>Get-ChildItem .\cpp -Filter *.dll -Name</w:t>
+      </w:r>
+    </w:p>
+    <w:p>
+      <w:pPr>
+        <w:keepNext/>
+      </w:pPr>
+    </w:p>
+    <w:p>
+      <w:pPr>
+        <w:pStyle w:val="RequiredOutput"/>
+        <w:keepNext/>
+      </w:pPr>
+      <w:r>
+        <w:t>libcrypto-3-x64.dll</w:t>
+      </w:r>
+    </w:p>
+    <w:p>
+      <w:pPr>
+        <w:pStyle w:val="RequiredOutput"/>
+        <w:keepNext/>
+      </w:pPr>
+      <w:r>
+        <w:t>libmysql.dll</w:t>
+      </w:r>
+    </w:p>
+    <w:p>
+      <w:pPr>
+        <w:pStyle w:val="RequiredOutput"/>
+        <w:keepNext/>
+      </w:pPr>
+      <w:r>
+        <w:t>libssl-3-x64.dll</w:t>
+      </w:r>
+    </w:p>
+    <w:p>
+      <w:pPr>
+        <w:pStyle w:val="RequiredOutput"/>
+        <w:keepNext/>
+      </w:pPr>
+      <w:r>
+        <w:t>libcrypto-3-x64.dll</w:t>
+      </w:r>
+    </w:p>
+    <w:p>
+      <w:pPr>
+        <w:pStyle w:val="RequiredOutput"/>
+        <w:keepNext/>
+      </w:pPr>
+      <w:r>
+        <w:t>libssl-3-x64.dll</w:t>
+      </w:r>
+    </w:p>
+    <w:p>
+      <w:pPr>
+        <w:pStyle w:val="RequiredOutput"/>
+      </w:pPr>
+      <w:r>
+        <w:t>mysqlcppconn-10-vs14.dll</w:t>
+      </w:r>
+    </w:p>
+    <w:p>
+      <w:pPr>
+        <w:keepNext/>
+      </w:pPr>
+    </w:p>
+    <w:p>
+      <w:pPr>
+        <w:pStyle w:val="Heading3"/>
+      </w:pPr>
+      <w:r>
+        <w:t>Linux or macOS Connector Setup</w:t>
+      </w:r>
+    </w:p>
+    <w:p>
+      <w:pPr>
+        <w:keepNext/>
+      </w:pPr>
+      <w:r>
+        <w:t>On Ubuntu, python3 -m venv needs the python3-venv package first: sudo apt install python3-venv. C and C++ need no copies on Linux or macOS: the system finds the libraries the packages installed.</w:t>
+      </w:r>
+    </w:p>
+    <w:p>
+      <w:pPr>
+        <w:keepNext/>
+      </w:pPr>
     </w:p>
     <w:p>
       <w:pPr>
@@ -2050,7 +2688,7 @@
         <w:keepNext/>
       </w:pPr>
       <w:r>
-        <w:t xml:space="preserve">    "$server\bin\libcrypto-3-x64.dll" .\c</w:t>
+        <w:t>python3 -m venv ./python/.venv</w:t>
       </w:r>
     </w:p>
     <w:p>
@@ -2059,183 +2697,7 @@
         <w:keepNext/>
       </w:pPr>
       <w:r>
-        <w:t>$connector = "C:\Program Files\MySQL\MySQL Connector C++ 26.7"</w:t>
-      </w:r>
-    </w:p>
-    <w:p>
-      <w:pPr>
-        <w:pStyle w:val="CommandBlock"/>
-        <w:keepNext/>
-      </w:pPr>
-      <w:r>
-        <w:t>Copy-Item "$connector\lib64\mysqlcppconn-10-vs14.dll", `</w:t>
-      </w:r>
-    </w:p>
-    <w:p>
-      <w:pPr>
-        <w:pStyle w:val="CommandBlock"/>
-        <w:keepNext/>
-      </w:pPr>
-      <w:r>
-        <w:t xml:space="preserve">    "$connector\lib64\libssl-3-x64.dll", `</w:t>
-      </w:r>
-    </w:p>
-    <w:p>
-      <w:pPr>
-        <w:pStyle w:val="CommandBlock"/>
-      </w:pPr>
-      <w:r>
-        <w:t xml:space="preserve">    "$connector\lib64\libcrypto-3-x64.dll" .\cpp</w:t>
-      </w:r>
-    </w:p>
-    <w:p>
-      <w:pPr>
-        <w:keepNext/>
-      </w:pPr>
-    </w:p>
-    <w:p>
-      <w:pPr>
-        <w:pStyle w:val="Heading3"/>
-      </w:pPr>
-      <w:r>
-        <w:t>Windows PowerShell Library Check</w:t>
-      </w:r>
-    </w:p>
-    <w:p>
-      <w:pPr>
-        <w:pStyle w:val="CommandBlock"/>
-        <w:keepNext/>
-      </w:pPr>
-      <w:r>
-        <w:t>Get-ChildItem .\c -Filter *.dll -Name</w:t>
-      </w:r>
-    </w:p>
-    <w:p>
-      <w:pPr>
-        <w:pStyle w:val="CommandBlock"/>
-      </w:pPr>
-      <w:r>
-        <w:t>Get-ChildItem .\cpp -Filter *.dll -Name</w:t>
-      </w:r>
-    </w:p>
-    <w:p>
-      <w:pPr>
-        <w:keepNext/>
-      </w:pPr>
-    </w:p>
-    <w:p>
-      <w:pPr>
-        <w:pStyle w:val="RequiredOutput"/>
-        <w:keepNext/>
-      </w:pPr>
-      <w:r>
-        <w:t>libcrypto-3-x64.dll</w:t>
-      </w:r>
-    </w:p>
-    <w:p>
-      <w:pPr>
-        <w:pStyle w:val="RequiredOutput"/>
-        <w:keepNext/>
-      </w:pPr>
-      <w:r>
-        <w:t>libmysql.dll</w:t>
-      </w:r>
-    </w:p>
-    <w:p>
-      <w:pPr>
-        <w:pStyle w:val="RequiredOutput"/>
-        <w:keepNext/>
-      </w:pPr>
-      <w:r>
-        <w:t>libssl-3-x64.dll</w:t>
-      </w:r>
-    </w:p>
-    <w:p>
-      <w:pPr>
-        <w:pStyle w:val="RequiredOutput"/>
-        <w:keepNext/>
-      </w:pPr>
-      <w:r>
-        <w:t>libcrypto-3-x64.dll</w:t>
-      </w:r>
-    </w:p>
-    <w:p>
-      <w:pPr>
-        <w:pStyle w:val="RequiredOutput"/>
-        <w:keepNext/>
-      </w:pPr>
-      <w:r>
-        <w:t>libssl-3-x64.dll</w:t>
-      </w:r>
-    </w:p>
-    <w:p>
-      <w:pPr>
-        <w:pStyle w:val="RequiredOutput"/>
-      </w:pPr>
-      <w:r>
-        <w:t>mysqlcppconn-10-vs14.dll</w:t>
-      </w:r>
-    </w:p>
-    <w:p>
-      <w:pPr>
-        <w:keepNext/>
-      </w:pPr>
-    </w:p>
-    <w:p>
-      <w:pPr>
-        <w:pStyle w:val="Heading3"/>
-      </w:pPr>
-      <w:r>
-        <w:t>Linux or macOS Connector Setup</w:t>
-      </w:r>
-    </w:p>
-    <w:p>
-      <w:pPr>
-        <w:keepNext/>
-      </w:pPr>
-      <w:r>
-        <w:t>On Ubuntu, python3 -m venv needs the python3-venv package first: sudo apt install python3-venv. C and C++ need no copies on Linux or macOS: the system finds the libraries the packages installed.</w:t>
-      </w:r>
-    </w:p>
-    <w:p>
-      <w:pPr>
-        <w:keepNext/>
-      </w:pPr>
-    </w:p>
-    <w:p>
-      <w:pPr>
-        <w:pStyle w:val="CommandBlock"/>
-        <w:keepNext/>
-      </w:pPr>
-      <w:r>
-        <w:t>npm --prefix ./typescript install --ignore-scripts --no-audit --no-fund</w:t>
-      </w:r>
-    </w:p>
-    <w:p>
-      <w:pPr>
-        <w:pStyle w:val="CommandBlock"/>
-        <w:keepNext/>
-      </w:pPr>
-      <w:r>
-        <w:t>python3 -m venv ./python/.venv</w:t>
-      </w:r>
-    </w:p>
-    <w:p>
-      <w:pPr>
-        <w:pStyle w:val="CommandBlock"/>
-        <w:keepNext/>
-      </w:pPr>
-      <w:r>
         <w:t>./python/.venv/bin/python -m pip install mysql-connector-python==26.7.0</w:t>
-      </w:r>
-    </w:p>
-    <w:p>
-      <w:pPr>
-        <w:pStyle w:val="CommandBlock"/>
-        <w:keepNext/>
-      </w:pPr>
-      <w:r>
-        <w:t>go -C ./go mod tidy</w:t>
       </w:r>
     </w:p>
     <w:p>
@@ -14254,7 +14716,10 @@
     </w:p>
     <w:p>
       <w:r>
-        <w:t>These files follow the same pattern as the earlier lessons. Remember, a project file pins each package to one version, so every learner builds the same thing (Lesson 2.17). Each .csproj names MySqlConnector 2.6.2 in a PackageReference. go.mod names this lesson's Go module, example.com/setupcheck, requires the driver at v1.10.1, and lists filippo.io/edwards25519, a package the driver itself uses, as indirect. package.json names mysql2 3.24.5 under dependencies.</w:t>
+        <w:t>These are the files the setup commands wrote, shown here so you can check yours. Remember, a project file pins each package to one version, so every learner builds the same thing (Lesson 2.17). Each .csproj names MySqlConnector 2.6.2 in a PackageReference. go.mod names this lesson's Go module, example.com/setupcheck, requires the driver at v1.10.1, and lists filippo.io/edwards25519, a package the driver itself uses, as indirect. package.json names mysql2 3.24.5 under dependencies. Your go line shows your ow</w:t>
+      </w:r>
+      <w:r>
+        <w:t>n Go version, your go.mod marks the driver // indirect too, because go get ran before the .go files existed, and the blank lines and the order of the package.json fields may differ.</w:t>
       </w:r>
     </w:p>
     <w:p>
@@ -14700,164 +15165,6 @@
       </w:pPr>
       <w:r>
         <w:t xml:space="preserve">  }</w:t>
-      </w:r>
-    </w:p>
-    <w:p>
-      <w:pPr>
-        <w:pStyle w:val="SourceCode"/>
-      </w:pPr>
-      <w:r>
-        <w:t>}</w:t>
-      </w:r>
-    </w:p>
-    <w:p>
-      <w:pPr>
-        <w:keepNext/>
-      </w:pPr>
-    </w:p>
-    <w:p>
-      <w:pPr>
-        <w:keepNext/>
-      </w:pPr>
-    </w:p>
-    <w:p>
-      <w:pPr>
-        <w:pStyle w:val="Heading2"/>
-      </w:pPr>
-      <w:r>
-        <w:t>typescript/tsconfig.json</w:t>
-      </w:r>
-    </w:p>
-    <w:p>
-      <w:pPr>
-        <w:pStyle w:val="SourceCode"/>
-        <w:keepNext/>
-      </w:pPr>
-      <w:r>
-        <w:t>{</w:t>
-      </w:r>
-    </w:p>
-    <w:p>
-      <w:pPr>
-        <w:pStyle w:val="SourceCode"/>
-        <w:keepNext/>
-      </w:pPr>
-      <w:r>
-        <w:t xml:space="preserve">  "compilerOptions": {</w:t>
-      </w:r>
-    </w:p>
-    <w:p>
-      <w:pPr>
-        <w:pStyle w:val="SourceCode"/>
-      </w:pPr>
-      <w:r>
-        <w:t xml:space="preserve">    "target": "ES2022",</w:t>
-      </w:r>
-    </w:p>
-    <w:p>
-      <w:pPr>
-        <w:pStyle w:val="SourceCode"/>
-      </w:pPr>
-      <w:r>
-        <w:t xml:space="preserve">    "module": "NodeNext",</w:t>
-      </w:r>
-    </w:p>
-    <w:p>
-      <w:pPr>
-        <w:pStyle w:val="SourceCode"/>
-      </w:pPr>
-      <w:r>
-        <w:t xml:space="preserve">    "moduleResolution": "NodeNext",</w:t>
-      </w:r>
-    </w:p>
-    <w:p>
-      <w:pPr>
-        <w:pStyle w:val="SourceCode"/>
-      </w:pPr>
-      <w:r>
-        <w:t xml:space="preserve">    "rootDir": "src",</w:t>
-      </w:r>
-    </w:p>
-    <w:p>
-      <w:pPr>
-        <w:pStyle w:val="SourceCode"/>
-      </w:pPr>
-      <w:r>
-        <w:t xml:space="preserve">    "outDir": "dist",</w:t>
-      </w:r>
-    </w:p>
-    <w:p>
-      <w:pPr>
-        <w:pStyle w:val="SourceCode"/>
-      </w:pPr>
-      <w:r>
-        <w:t xml:space="preserve">    "strict": true,</w:t>
-      </w:r>
-    </w:p>
-    <w:p>
-      <w:pPr>
-        <w:pStyle w:val="SourceCode"/>
-      </w:pPr>
-      <w:r>
-        <w:t xml:space="preserve">    "types": [</w:t>
-      </w:r>
-    </w:p>
-    <w:p>
-      <w:pPr>
-        <w:pStyle w:val="SourceCode"/>
-      </w:pPr>
-      <w:r>
-        <w:t xml:space="preserve">      "node"</w:t>
-      </w:r>
-    </w:p>
-    <w:p>
-      <w:pPr>
-        <w:pStyle w:val="SourceCode"/>
-      </w:pPr>
-      <w:r>
-        <w:t xml:space="preserve">    ],</w:t>
-      </w:r>
-    </w:p>
-    <w:p>
-      <w:pPr>
-        <w:pStyle w:val="SourceCode"/>
-      </w:pPr>
-      <w:r>
-        <w:t xml:space="preserve">    "moduleDetection": "force"</w:t>
-      </w:r>
-    </w:p>
-    <w:p>
-      <w:pPr>
-        <w:pStyle w:val="SourceCode"/>
-      </w:pPr>
-      <w:r>
-        <w:t xml:space="preserve">  },</w:t>
-      </w:r>
-    </w:p>
-    <w:p>
-      <w:pPr>
-        <w:pStyle w:val="SourceCode"/>
-      </w:pPr>
-      <w:r>
-        <w:t xml:space="preserve">  "include": [</w:t>
-      </w:r>
-    </w:p>
-    <w:p>
-      <w:pPr>
-        <w:pStyle w:val="SourceCode"/>
-        <w:keepNext/>
-      </w:pPr>
-      <w:r>
-        <w:t xml:space="preserve">    "src/**/*.ts"</w:t>
-      </w:r>
-    </w:p>
-    <w:p>
-      <w:pPr>
-        <w:pStyle w:val="SourceCode"/>
-        <w:keepNext/>
-      </w:pPr>
-      <w:r>
-        <w:t xml:space="preserve">  ]</w:t>
       </w:r>
     </w:p>
     <w:p>
@@ -15783,31 +16090,31 @@
       </w:rPr>
     </w:lvl>
   </w:abstractNum>
-  <w:num w:numId="1" w16cid:durableId="1270552527">
+  <w:num w:numId="1" w16cid:durableId="1151870425">
     <w:abstractNumId w:val="8"/>
   </w:num>
-  <w:num w:numId="2" w16cid:durableId="661154375">
+  <w:num w:numId="2" w16cid:durableId="2102723206">
     <w:abstractNumId w:val="6"/>
   </w:num>
-  <w:num w:numId="3" w16cid:durableId="1014765595">
+  <w:num w:numId="3" w16cid:durableId="1560438196">
     <w:abstractNumId w:val="5"/>
   </w:num>
-  <w:num w:numId="4" w16cid:durableId="1595438329">
+  <w:num w:numId="4" w16cid:durableId="1790122823">
     <w:abstractNumId w:val="4"/>
   </w:num>
-  <w:num w:numId="5" w16cid:durableId="941641697">
+  <w:num w:numId="5" w16cid:durableId="1266232552">
     <w:abstractNumId w:val="7"/>
   </w:num>
-  <w:num w:numId="6" w16cid:durableId="1282954458">
+  <w:num w:numId="6" w16cid:durableId="1468356183">
     <w:abstractNumId w:val="3"/>
   </w:num>
-  <w:num w:numId="7" w16cid:durableId="1214384758">
+  <w:num w:numId="7" w16cid:durableId="1863401498">
     <w:abstractNumId w:val="2"/>
   </w:num>
-  <w:num w:numId="8" w16cid:durableId="1282496635">
+  <w:num w:numId="8" w16cid:durableId="516424936">
     <w:abstractNumId w:val="1"/>
   </w:num>
-  <w:num w:numId="9" w16cid:durableId="1606112594">
+  <w:num w:numId="9" w16cid:durableId="29651183">
     <w:abstractNumId w:val="0"/>
   </w:num>
 </w:numbering>

</xml_diff>

<commit_message>
Volume 1, Chapter 4: each language uses its own tables; project-setup steps
</commit_message>
<xml_diff>
--- a/Volume 1/Chapter 04 - Databases/SPA_Vol1_Ch4_Lesson4_0_MySQL_Setup.docx
+++ b/Volume 1/Chapter 04 - Databases/SPA_Vol1_Ch4_Lesson4_0_MySQL_Setup.docx
@@ -95,10 +95,7 @@
     </w:p>
     <w:p>
       <w:r>
-        <w:t>Chapter 3 kept data in files that only your program opened. A database server is different: it is a separate program, always running, and your programs reach it over a connection, with a host, a port, a user, and a password. Real systems never connect as the administrator, and never keep the password in the source code, because a bug or a leaked password would then reach everything on the server. Setting this up once, carefully, means every later lesson simply connects; and knowing how the pieces fit lets y</w:t>
-      </w:r>
-      <w:r>
-        <w:t>ou fix a failed connection yourself instead of asking someone.</w:t>
+        <w:t>Chapter 3 kept data in files that only your program opened. A database server is different: it is a separate program, always running, and your programs reach it over a connection, with a host, a port, a user, and a password. Real systems never connect as the administrator, and never keep the password in the source code, because a bug or a leaked password would then reach everything on the server. Setting this up once, carefully, means every later lesson simply connects; and knowing how the pieces fit lets you fix a failed connection yourself instead of asking someone.</w:t>
       </w:r>
     </w:p>
     <w:p>
@@ -186,10 +183,7 @@
         <w:pStyle w:val="ListBullet"/>
       </w:pPr>
       <w:r>
-        <w:t>Remember, a secret is never written into the code or printed (Lesson 2.14). The programs read devuser's password from the SPA_DB_PASSWORD environment variable, which you set once, for your Windows account. A terminal copies the environment when it starts, so only a terminal opened after you set the variable has it. A user environment variable can be read only by your own Windows account and by administrators: good enough for a learning computer, while production systems keep passwords in a secret store, a s</w:t>
-      </w:r>
-      <w:r>
-        <w:t>ervice built to hand secrets only to the programs allowed to have them.</w:t>
+        <w:t>Remember, a secret is never written into the code or printed (Lesson 2.14). The programs read devuser's password from the SPA_DB_PASSWORD environment variable, which you set once, for your Windows account. A terminal copies the environment when it starts, so only a terminal opened after you set the variable has it. A user environment variable can be read only by your own Windows account and by administrators: good enough for a learning computer, while production systems keep passwords in a secret store, a service built to hand secrets only to the programs allowed to have them.</w:t>
       </w:r>
     </w:p>
     <w:p>
@@ -784,10 +778,7 @@
     </w:p>
     <w:p>
       <w:r>
-        <w:t>Download MySQL Community Server 26.7 for Windows (the MSI installer) from MySQL's download page, dev.mysql.com/downloads/mysql; when the page asks you to log in or sign up, choose No thanks, just start my download. Run the installer from your Downloads folder. Windows shows its User Account Control box, as in Lesson 1.1; check the Verified publisher reads Oracle America, Inc. and choose Yes. Choose the Typical setup. When it finishes, it opens MySQL Configurator. Only these choices matter for the course; ke</w:t>
-      </w:r>
-      <w:r>
-        <w:t>ep every other default:</w:t>
+        <w:t>Download MySQL Community Server 26.7 for Windows (the MSI installer) from MySQL's download page, dev.mysql.com/downloads/mysql; when the page asks you to log in or sign up, choose No thanks, just start my download. Run the installer from your Downloads folder. Windows shows its User Account Control box, as in Lesson 1.1; check the Verified publisher reads Oracle America, Inc. and choose Yes. Choose the Typical setup. When it finishes, it opens MySQL Configurator. Only these choices matter for the course; keep every other default:</w:t>
       </w:r>
     </w:p>
     <w:p>
@@ -1289,10 +1280,7 @@
     </w:p>
     <w:p>
       <w:r>
-        <w:t>Now connect as devuser from the command line and do what every program in this lesson does: show its rights, create spa_setup_check, ask for the server's version, and drop the database again. -u names the user, -h the host, and -P (a capital P) the port. -p makes the client ask for devuser's password; type it and press Enter (nothing shows as you type). -e runs the statements in $checks and ends the client, and -t prints each answer as a table. The ` at the end of the $checks line continues it on the next l</w:t>
-      </w:r>
-      <w:r>
-        <w:t>ine, and + joins the two pieces of text into one.</w:t>
+        <w:t>Now connect as devuser from the command line and do what every program in this lesson does: show its rights, create spa_setup_check, ask for the server's version, and drop the database again. -u names the user, -h the host, and -P (a capital P) the port. -p makes the client ask for devuser's password; type it and press Enter (nothing shows as you type). -e runs the statements in $checks and ends the client, and -t prints each answer as a table. The ` at the end of the $checks line continues it on the next line, and + joins the two pieces of text into one.</w:t>
       </w:r>
     </w:p>
     <w:p>
@@ -1670,10 +1658,7 @@
     </w:p>
     <w:p>
       <w:r>
-        <w:t>Only the C++ programs need this step. On Windows, install Visual Studio Build Tools 2026 from visualstudio.microsoft.com/downloads (under Tools for Visual Studio) and choose the Desktop development with C++ workload. Windows shows its User Account Control box, as in Lesson 1.1; check the Verified publisher reads Microsoft Corporation and choose Yes. Then install MySQL Connector/C++ 26.7 for Windows, x86 64-bit (the MSI installer), from dev.mysql.com/downloads/connector/cpp; it installs into C:\Program Files</w:t>
-      </w:r>
-      <w:r>
-        <w:t>\MySQL\MySQL Connector C++ 26.7. Its User Account Control box shows the Verified publisher Oracle America, Inc., as MySQL Server's did; choose Yes. The C++ Implementation section explains why C++ uses Visual C++ for database lessons on Windows, and its build commands check both installs.</w:t>
+        <w:t>Only the C++ programs need this step. On Windows, install Visual Studio Build Tools 2026 from visualstudio.microsoft.com/downloads (under Tools for Visual Studio) and choose the Desktop development with C++ workload. Windows shows its User Account Control box, as in Lesson 1.1; check the Verified publisher reads Microsoft Corporation and choose Yes. Then install MySQL Connector/C++ 26.7 for Windows, x86 64-bit (the MSI installer), from dev.mysql.com/downloads/connector/cpp; it installs into C:\Program Files\MySQL\MySQL Connector C++ 26.7. Its User Account Control box shows the Verified publisher Oracle America, Inc., as MySQL Server's did; choose Yes. The C++ Implementation section explains why C++ uses Visual C++ for database lessons on Windows, and its build commands check both installs.</w:t>
       </w:r>
     </w:p>
     <w:p>
@@ -1856,10 +1841,7 @@
         <w:keepNext/>
       </w:pPr>
       <w:r>
-        <w:t xml:space="preserve">Next, let the tools create each project's settings file, as in Chapter 1 and Lesson 2.17. Remember, dotnet new console -o makes a C# project in the folder -o names, with a .csproj file and a Program.cs. The starter Program.cs only prints Hello, World!; you replace it with this lesson's code in the C# section. Remember, dotnet add package writes the pinned PackageReference into the .csproj, and the package is downloaded into your NuGet cache: here MySqlConnector 2.6.2, once for each C# project. Remember, go </w:t>
-      </w:r>
-      <w:r>
-        <w:t>mod init makes the .\go folder a module by writing .\go\go.mod, and go get pins the module in go.mod and go.sum: here the MySQL driver at v1.10.1. The go line shows the Go version you have installed. No .go file imports the driver yet, so go get marks it // indirect; the build works either way.</w:t>
+        <w:t>Next, let the tools create each project's settings file, as in Chapter 1 and Lesson 2.17. Remember, dotnet new console -o makes a C# project in the folder -o names, with a .csproj file and a Program.cs. The starter Program.cs only prints Hello, World!; you replace it with this lesson's code in the C# section. Remember, dotnet add package writes the pinned PackageReference into the .csproj, and the package is downloaded into your NuGet cache: here MySqlConnector 2.6.2, once for each C# project. Remember, go mod init makes the .\go folder a module by writing .\go\go.mod, and go get pins the module in go.mod and go.sum: here the MySQL driver at v1.10.1. The go line shows the Go version you have installed. No .go file imports the driver yet, so go get marks it // indirect; the build works either way.</w:t>
       </w:r>
     </w:p>
     <w:p>
@@ -2774,23 +2756,17 @@
         <w:pStyle w:val="ListBullet"/>
       </w:pPr>
       <w:r>
-        <w:t xml:space="preserve">database exists (error 1007): an earlier run stopped partway and left spa_setup_check behind. The C++, C#, Python, and TypeScript Basic programs stop with this message; the C and Go Basic programs ignore a failed statement and carry on, and the Production-Minded programs start with DROP DATABASE IF EXISTS, so they clean up by themselves. To remove it, run &amp; $mysql -u devuser -h 127.0.0.1 -P 3306 -p -e "DROP DATABASE spa_setup_check" (on Linux or macOS, start it with mysql instead of &amp; $mysql), then run the </w:t>
-      </w:r>
-      <w:r>
-        <w:t>program again.</w:t>
-      </w:r>
-    </w:p>
-    <w:p>
-      <w:pPr>
-        <w:keepNext/>
-      </w:pPr>
-    </w:p>
-    <w:p>
-      <w:r>
-        <w:t>Each Production-Minded program also has a Missing Password Check, which runs it without SPA_DB_PASSWORD on purpose. On Windows, the first line keeps the password in $savedPassword, a variable of this terminal only; Remove-Item Env:SPA_DB_PASSWORD removes the variable from this terminal's environment, the program runs, $LASTEXITCODE shows its exit code, and the last line puts the variable back. On Linux or macOS, env -u SPA_DB_PASSWORD runs one program with the variable removed from that program's own copy o</w:t>
-      </w:r>
-      <w:r>
-        <w:t>f the environment, so there is nothing to restore. Nothing outside the terminal changes, nothing prints the password, and the program stops before it tries to connect, so it makes no failed login attempt.</w:t>
+        <w:t>database exists (error 1007): an earlier run stopped partway and left spa_setup_check behind. The C++, C#, Python, and TypeScript Basic programs stop with this message; the C and Go Basic programs ignore a failed statement and carry on, and the Production-Minded programs start with DROP DATABASE IF EXISTS, so they clean up by themselves. To remove it, run &amp; $mysql -u devuser -h 127.0.0.1 -P 3306 -p -e "DROP DATABASE spa_setup_check" (on Linux or macOS, start it with mysql instead of &amp; $mysql), then run the program again.</w:t>
+      </w:r>
+    </w:p>
+    <w:p>
+      <w:pPr>
+        <w:keepNext/>
+      </w:pPr>
+    </w:p>
+    <w:p>
+      <w:r>
+        <w:t>Each Production-Minded program also has a Missing Password Check, which runs it without SPA_DB_PASSWORD on purpose. On Windows, the first line keeps the password in $savedPassword, a variable of this terminal only; Remove-Item Env:SPA_DB_PASSWORD removes the variable from this terminal's environment, the program runs, $LASTEXITCODE shows its exit code, and the last line puts the variable back. On Linux or macOS, env -u SPA_DB_PASSWORD runs one program with the variable removed from that program's own copy of the environment, so there is nothing to restore. Nothing outside the terminal changes, nothing prints the password, and the program stops before it tries to connect, so it makes no failed login attempt.</w:t>
       </w:r>
     </w:p>
     <w:p>
@@ -3090,10 +3066,7 @@
     </w:p>
     <w:p>
       <w:r>
-        <w:t>C talks to MySQL through MySQL's C API, the client library that comes with MySQL Server. Remember, a header declares and a library provides, and the build command names where they are (Lesson 2.17): -I adds MySQL's include folder, where mysql.h is; -L adds its lib folder; and -lmysql links libmysql.lib, which connects the program to libmysql.dll. Remember also that a DLL must sit next to the program or on its search path: libmysql.dll and the two OpenSSL DLLs it uses to encrypt the connection, libssl-3-x64.</w:t>
-      </w:r>
-      <w:r>
-        <w:t>dll and libcrypto-3-x64.dll, are the three files the Library Setup copied into the c folder. The C API is plain C, so gcc can use it even though MySQL built it with Visual C++.</w:t>
+        <w:t>C talks to MySQL through MySQL's C API, the client library that comes with MySQL Server. Remember, a header declares and a library provides, and the build command names where they are (Lesson 2.17): -I adds MySQL's include folder, where mysql.h is; -L adds its lib folder; and -lmysql links libmysql.lib, which connects the program to libmysql.dll. Remember also that a DLL must sit next to the program or on its search path: libmysql.dll and the two OpenSSL DLLs it uses to encrypt the connection, libssl-3-x64.dll and libcrypto-3-x64.dll, are the three files the Library Setup copied into the c folder. The C API is plain C, so gcc can use it even though MySQL built it with Visual C++.</w:t>
       </w:r>
     </w:p>
     <w:p>
@@ -3116,10 +3089,7 @@
     </w:p>
     <w:p>
       <w:r>
-        <w:t>Start with the most direct version: main reads SPA_DB_PASSWORD, creates a connection handle with mysql_init, connects with mysql_real_connect, sends CREATE DATABASE, SELECT VERSION(), and DROP DATABASE with mysql_query, prints a line after each step, and closes the connection. Like every Basic version in this lesson, it first checks that SPA_DB_PASSWORD is set, so a missing variable never turns into a failed login or a crash. Even this Basic version checks mysql_real_connect's result, because using a handle</w:t>
-      </w:r>
-      <w:r>
-        <w:t xml:space="preserve"> that never connected would fail at every later step and crash at mysql_fetch_row. Every step is commented, so read the comments as you type it.</w:t>
+        <w:t>Start with the most direct version: main reads SPA_DB_PASSWORD, creates a connection handle with mysql_init, connects with mysql_real_connect, sends CREATE DATABASE, SELECT VERSION(), and DROP DATABASE with mysql_query, prints a line after each step, and closes the connection. Like every Basic version in this lesson, it first checks that SPA_DB_PASSWORD is set, so a missing variable never turns into a failed login or a crash. Even this Basic version checks mysql_real_connect's result, because using a handle that never connected would fail at every later step and crash at mysql_fetch_row. Every step is commented, so read the comments as you type it.</w:t>
       </w:r>
     </w:p>
     <w:p>
@@ -3905,10 +3875,7 @@
     </w:p>
     <w:p>
       <w:r>
-        <w:t xml:space="preserve">The Production-Minded version prints the same lines. It starts with DROP DATABASE IF EXISTS spa_setup_check, which drops the test database only if an earlier run left it behind, so every run starts clean. connect_server returns 0, or -1 when the connection fails; main then prints the two Error lines with mysql_error's reason, closes the handle, and returns 1. run_statement sends one statement and prints one Error line when the server refuses it, and check_setup returns -1 at the first step that fails. main </w:t>
-      </w:r>
-      <w:r>
-        <w:t>closes the connection once, after check_setup, whatever it returned.</w:t>
+        <w:t>The Production-Minded version prints the same lines. It starts with DROP DATABASE IF EXISTS spa_setup_check, which drops the test database only if an earlier run left it behind, so every run starts clean. connect_server returns 0, or -1 when the connection fails; main then prints the two Error lines with mysql_error's reason, closes the handle, and returns 1. run_statement sends one statement and prints one Error line when the server refuses it, and check_setup returns -1 at the first step that fails. main closes the connection once, after check_setup, whatever it returned.</w:t>
       </w:r>
     </w:p>
     <w:p>
@@ -5145,10 +5112,7 @@
     </w:p>
     <w:p>
       <w:r>
-        <w:t>Both versions read SPA_DB_PASSWORD, connect to 127.0.0.1:3306 as devuser, create spa_setup_check, print the server version, drop the database, and close the connection, and both refuse to start without the password. The Basic version does it all in main and trusts every step after that. The Production-Minded version connects through connect_server, which the Chapter 4 lessons and project reuse, reports a failed connection with its reason and a failed statement with the server's message, starts clean with DR</w:t>
-      </w:r>
-      <w:r>
-        <w:t>OP DATABASE IF EXISTS, and closes the connection with its cleanup form even after an error.</w:t>
+        <w:t>Both versions read SPA_DB_PASSWORD, connect to 127.0.0.1:3306 as devuser, create spa_setup_check, print the server version, drop the database, and close the connection, and both refuse to start without the password. The Basic version does it all in main and trusts every step after that. The Production-Minded version connects through connect_server, which the Chapter 4 lessons and project reuse, reports a failed connection with its reason and a failed statement with the server's message, starts clean with DROP DATABASE IF EXISTS, and closes the connection with its cleanup form even after an error.</w:t>
       </w:r>
     </w:p>
     <w:p>
@@ -5176,10 +5140,7 @@
     </w:p>
     <w:p>
       <w:r>
-        <w:t>C++ uses MySQL Connector/C++ 26.7 and its classic API, the one modeled on Java's database API (JDBC): a driver opens a sql::Connection, a sql::Statement sends SQL, and a sql::ResultSet holds returned rows. On Windows, this chapter builds the C++ programs with Visual C++, Microsoft's compiler, instead of g++. The connector's Windows files are built with Visual C++, and C++ libraries from the two compilers cannot be mixed: they lay out objects such as std::string differently, so a g++ program cannot use the c</w:t>
-      </w:r>
-      <w:r>
-        <w:t>onnector's DLL. The same source builds with g++ on Linux, where the packaged connector is built for g++, and every other lesson in the course stays with g++. Remember, a DLL must sit next to the program (Lesson 2.17): the Library Setup copied mysqlcppconn-10-vs14.dll and its two OpenSSL DLLs into the cpp folder.</w:t>
+        <w:t>C++ uses MySQL Connector/C++ 26.7 and its classic API, the one modeled on Java's database API (JDBC): a driver opens a sql::Connection, a sql::Statement sends SQL, and a sql::ResultSet holds returned rows. On Windows, this chapter builds the C++ programs with Visual C++, Microsoft's compiler, instead of g++. The connector's Windows files are built with Visual C++, and C++ libraries from the two compilers cannot be mixed: they lay out objects such as std::string differently, so a g++ program cannot use the connector's DLL. The same source builds with g++ on Linux, where the packaged connector is built for g++, and every other lesson in the course stays with g++. Remember, a DLL must sit next to the program (Lesson 2.17): the Library Setup copied mysqlcppconn-10-vs14.dll and its two OpenSSL DLLs into the cpp folder.</w:t>
       </w:r>
     </w:p>
     <w:p>
@@ -5202,10 +5163,7 @@
     </w:p>
     <w:p>
       <w:r>
-        <w:t>Start with the most direct version: main reads SPA_DB_PASSWORD, connects through the driver, keeps the connection, the statement, and the rows in std::unique_ptr objects, sends CREATE DATABASE, SELECT VERSION(), and DROP DATABASE, and prints a line after each step. Like every Basic version in this lesson, it first checks that SPA_DB_PASSWORD is set, so a missing variable never turns into a failed login or a crash. After that, it trusts every step; the Production-Minded version checks them. Every step is com</w:t>
-      </w:r>
-      <w:r>
-        <w:t>mented, so read the comments as you type it.</w:t>
+        <w:t>Start with the most direct version: main reads SPA_DB_PASSWORD, connects through the driver, keeps the connection, the statement, and the rows in std::unique_ptr objects, sends CREATE DATABASE, SELECT VERSION(), and DROP DATABASE, and prints a line after each step. Like every Basic version in this lesson, it first checks that SPA_DB_PASSWORD is set, so a missing variable never turns into a failed login or a crash. After that, it trusts every step; the Production-Minded version checks them. Every step is commented, so read the comments as you type it.</w:t>
       </w:r>
     </w:p>
     <w:p>
@@ -5771,10 +5729,7 @@
     </w:p>
     <w:p>
       <w:r>
-        <w:t>The first two commands turn this terminal into a Developer PowerShell: Launch-VsDevShell, from the Build Tools, puts cl, the Visual C++ compiler, on PATH for this terminal only, and -Arch amd64 picks 64-bit programs. Run them once in each new terminal. cl's options match the g++ ones you know: /std:c++20 is -std=c++20; /W4 /WX turn on the warnings and make them errors; /EHsc turns on standard C++ exceptions; /MD uses the same C++ runtime DLL the connector uses; /external:I adds the connector's include folde</w:t>
-      </w:r>
-      <w:r>
-        <w:t>r, as -I would, and /external:W0 hides warnings inside those headers only; /Fo:cpp\ and /Fe: name the object file's folder and the program; /link /LIBPATH: is -L, and mysqlcppconn.lib is -lmysqlcppconn. /D_CRT_SECURE_NO_WARNINGS turns off one Visual C++ warning: it calls std::getenv unsafe and suggests _dupenv_s, which only Visual C++ has, while std::getenv is standard C++ and safe for reading one variable.</w:t>
+        <w:t>The first two commands turn this terminal into a Developer PowerShell: Launch-VsDevShell, from the Build Tools, puts cl, the Visual C++ compiler, on PATH for this terminal only, and -Arch amd64 picks 64-bit programs. Run them once in each new terminal. cl's options match the g++ ones you know: /std:c++20 is -std=c++20; /W4 /WX turn on the warnings and make them errors; /EHsc turns on standard C++ exceptions; /MD uses the same C++ runtime DLL the connector uses; /external:I adds the connector's include folder, as -I would, and /external:W0 hides warnings inside those headers only; /Fo:cpp\ and /Fe: name the object file's folder and the program; /link /LIBPATH: is -L, and mysqlcppconn.lib is -lmysqlcppconn. /D_CRT_SECURE_NO_WARNINGS turns off one Visual C++ warning: it calls std::getenv unsafe and suggests _dupenv_s, which only Visual C++ has, while std::getenv is standard C++ and safe for reading one variable.</w:t>
       </w:r>
     </w:p>
     <w:p>
@@ -5929,10 +5884,7 @@
         <w:pStyle w:val="ListBullet"/>
       </w:pPr>
       <w:r>
-        <w:t xml:space="preserve">If nothing prints at all and the exit code is -1073741515, a DLL is missing from the cpp folder: rerun the Library Setup. If PowerShell shows an error that includes The term 'cl' is not recognized, the Launch-VsDevShell line did not run in this terminal. If the program stops early without a word and the exit code is -1073740791 (0xC0000409), the connector threw an exception that this Basic version does not catch, and a Visual C++ program then ends silently. Run the Production-Minded program: it catches the </w:t>
-      </w:r>
-      <w:r>
-        <w:t>exception and prints the reason, such as Access denied when SPA_DB_PASSWORD holds a different password from the one CREATE USER set.</w:t>
+        <w:t>If nothing prints at all and the exit code is -1073741515, a DLL is missing from the cpp folder: rerun the Library Setup. If PowerShell shows an error that includes The term 'cl' is not recognized, the Launch-VsDevShell line did not run in this terminal. If the program stops early without a word and the exit code is -1073740791 (0xC0000409), the connector threw an exception that this Basic version does not catch, and a Visual C++ program then ends silently. Run the Production-Minded program: it catches the exception and prints the reason, such as Access denied when SPA_DB_PASSWORD holds a different password from the one CREATE USER set.</w:t>
       </w:r>
     </w:p>
     <w:p>
@@ -5971,10 +5923,7 @@
     </w:p>
     <w:p>
       <w:r>
-        <w:t>The Production-Minded version prints the same lines. It starts with DROP DATABASE IF EXISTS spa_setup_check, which drops the test database only if an earlier run left it behind, so every run starts clean. connectServer returns the connection in a std::unique_ptr, or throws a std::runtime_error with the server and the connector's reason when it cannot connect. checkSetup sends the statements; a statement the server refuses throws an sql::SQLException. main's one catch reports either kind as one Error line, a</w:t>
-      </w:r>
-      <w:r>
-        <w:t>nd the destructors close the statement and the connection on the way out.</w:t>
+        <w:t>The Production-Minded version prints the same lines. It starts with DROP DATABASE IF EXISTS spa_setup_check, which drops the test database only if an earlier run left it behind, so every run starts clean. connectServer returns the connection in a std::unique_ptr, or throws a std::runtime_error with the server and the connector's reason when it cannot connect. checkSetup sends the statements; a statement the server refuses throws an sql::SQLException. main's one catch reports either kind as one Error line, and the destructors close the statement and the connection on the way out.</w:t>
       </w:r>
     </w:p>
     <w:p>
@@ -7070,10 +7019,7 @@
     </w:p>
     <w:p>
       <w:r>
-        <w:t>Both versions read SPA_DB_PASSWORD, connect to 127.0.0.1:3306 as devuser, create spa_setup_check, print the server version, drop the database, and close the connection, and both refuse to start without the password. The Basic version does it all in main and trusts every step after that. The Production-Minded version connects through connectServer, which the Chapter 4 lessons and project reuse, reports a failed connection with its reason and a failed statement with the server's message, starts clean with DRO</w:t>
-      </w:r>
-      <w:r>
-        <w:t>P DATABASE IF EXISTS, and closes the connection with its cleanup form even after an error.</w:t>
+        <w:t>Both versions read SPA_DB_PASSWORD, connect to 127.0.0.1:3306 as devuser, create spa_setup_check, print the server version, drop the database, and close the connection, and both refuse to start without the password. The Basic version does it all in main and trusts every step after that. The Production-Minded version connects through connectServer, which the Chapter 4 lessons and project reuse, reports a failed connection with its reason and a failed statement with the server's message, starts clean with DROP DATABASE IF EXISTS, and closes the connection with its cleanup form even after an error.</w:t>
       </w:r>
     </w:p>
     <w:p>
@@ -7124,10 +7070,7 @@
     </w:p>
     <w:p>
       <w:r>
-        <w:t>Start with the most direct version: Main reads SPA_DB_PASSWORD, collects the settings in a MySqlConnectionStringBuilder, opens a MySqlConnection, runs CREATE DATABASE, SELECT VERSION(), and DROP DATABASE as MySqlCommands, and prints a line after each step. Like every Basic version in this lesson, it first checks that SPA_DB_PASSWORD is set, so a missing variable never turns into a failed login or a crash. After that, it trusts every step; the Production-Minded version checks them. Every step is commented, s</w:t>
-      </w:r>
-      <w:r>
-        <w:t>o read the comments as you type it.</w:t>
+        <w:t>Start with the most direct version: Main reads SPA_DB_PASSWORD, collects the settings in a MySqlConnectionStringBuilder, opens a MySqlConnection, runs CREATE DATABASE, SELECT VERSION(), and DROP DATABASE as MySqlCommands, and prints a line after each step. Like every Basic version in this lesson, it first checks that SPA_DB_PASSWORD is set, so a missing variable never turns into a failed login or a crash. After that, it trusts every step; the Production-Minded version checks them. Every step is commented, so read the comments as you type it.</w:t>
       </w:r>
     </w:p>
     <w:p>
@@ -7888,10 +7831,7 @@
     </w:p>
     <w:p>
       <w:r>
-        <w:t xml:space="preserve">The Production-Minded version prints the same lines. It starts with DROP DATABASE IF EXISTS spa_setup_check, which drops the test database only if an earlier run left it behind, so every run starts clean. ConnectServer opens and returns the connection, or throws an Exception with the server and the connector's reason. RunStatement sends one statement that returns no rows, and CheckSetup runs the steps. Main's one catch reports either kind of failure as one Error line, and using closes the connection on the </w:t>
-      </w:r>
-      <w:r>
-        <w:t>way out.</w:t>
+        <w:t>The Production-Minded version prints the same lines. It starts with DROP DATABASE IF EXISTS spa_setup_check, which drops the test database only if an earlier run left it behind, so every run starts clean. ConnectServer opens and returns the connection, or throws an Exception with the server and the connector's reason. RunStatement sends one statement that returns no rows, and CheckSetup runs the steps. Main's one catch reports either kind of failure as one Error line, and using closes the connection on the way out.</w:t>
       </w:r>
     </w:p>
     <w:p>
@@ -9059,10 +8999,7 @@
     </w:p>
     <w:p>
       <w:r>
-        <w:t>Both versions read SPA_DB_PASSWORD, connect to 127.0.0.1:3306 as devuser, create spa_setup_check, print the server version, drop the database, and close the connection, and both refuse to start without the password. The Basic version does it all in Main and trusts every step after that. The Production-Minded version connects through ConnectServer, which the Chapter 4 lessons and project reuse, reports a failed connection with its reason and a failed statement with the server's message, starts clean with DRO</w:t>
-      </w:r>
-      <w:r>
-        <w:t>P DATABASE IF EXISTS, and closes the connection with its cleanup form even after an error.</w:t>
+        <w:t>Both versions read SPA_DB_PASSWORD, connect to 127.0.0.1:3306 as devuser, create spa_setup_check, print the server version, drop the database, and close the connection, and both refuse to start without the password. The Basic version does it all in Main and trusts every step after that. The Production-Minded version connects through ConnectServer, which the Chapter 4 lessons and project reuse, reports a failed connection with its reason and a failed statement with the server's message, starts clean with DROP DATABASE IF EXISTS, and closes the connection with its cleanup form even after an error.</w:t>
       </w:r>
     </w:p>
     <w:p>
@@ -9090,10 +9027,7 @@
     </w:p>
     <w:p>
       <w:r>
-        <w:t>Go has a database package in its standard library, database/sql, which talks to every database through a driver: github.com/go-sql-driver/mysql is MySQL's. Remember, go.mod's require line pins the driver's version, and go mod tidy downloaded it and recorded its checksums in go.sum (Lesson 2.17). sql.Open returns a *sql.DB, a pool: it opens connections when they are needed and reuses them, so sql.Open itself does not connect. Ping connects now, which is how the program finds out at once whether the server ca</w:t>
-      </w:r>
-      <w:r>
-        <w:t>n be reached.</w:t>
+        <w:t>Go has a database package in its standard library, database/sql, which talks to every database through a driver: github.com/go-sql-driver/mysql is MySQL's. Remember, go.mod's require line pins the driver's version, and go mod tidy downloaded it and recorded its checksums in go.sum (Lesson 2.17). sql.Open returns a *sql.DB, a pool: it opens connections when they are needed and reuses them, so sql.Open itself does not connect. Ping connects now, which is how the program finds out at once whether the server can be reached.</w:t>
       </w:r>
     </w:p>
     <w:p>
@@ -9116,10 +9050,7 @@
     </w:p>
     <w:p>
       <w:r>
-        <w:t>Start with the most direct version: main reads SPA_DB_PASSWORD, fills the driver's settings record, opens the pool with sql.Open, connects with Ping, runs CREATE DATABASE and DROP DATABASE with Exec and SELECT VERSION() with QueryRow, prints a line after each step, and closes the pool. Like every Basic version in this lesson, it first checks that SPA_DB_PASSWORD is set, so a missing variable never turns into a failed login or a crash. Like the C version, it also checks the error values of sql.Open and Ping,</w:t>
-      </w:r>
-      <w:r>
-        <w:t xml:space="preserve"> because without a connection every later step would silently do nothing; after that, it trusts every step. Every step is commented, so read the comments as you type it.</w:t>
+        <w:t>Start with the most direct version: main reads SPA_DB_PASSWORD, fills the driver's settings record, opens the pool with sql.Open, connects with Ping, runs CREATE DATABASE and DROP DATABASE with Exec and SELECT VERSION() with QueryRow, prints a line after each step, and closes the pool. Like every Basic version in this lesson, it first checks that SPA_DB_PASSWORD is set, so a missing variable never turns into a failed login or a crash. Like the C version, it also checks the error values of sql.Open and Ping, because without a connection every later step would silently do nothing; after that, it trusts every step. Every step is commented, so read the comments as you type it.</w:t>
       </w:r>
     </w:p>
     <w:p>
@@ -11168,10 +11099,7 @@
     </w:p>
     <w:p>
       <w:r>
-        <w:t>Both versions read SPA_DB_PASSWORD, connect to 127.0.0.1:3306 as devuser, create spa_setup_check, print the server version, drop the database, and close the connection, and both refuse to start without the password. The Basic version does it all in main and trusts every step after that. The Production-Minded version connects through connectServer, which the Chapter 4 lessons and project reuse, reports a failed connection with its reason and a failed statement with the server's message, starts clean with DRO</w:t>
-      </w:r>
-      <w:r>
-        <w:t>P DATABASE IF EXISTS, and closes the connection with its cleanup form even after an error.</w:t>
+        <w:t>Both versions read SPA_DB_PASSWORD, connect to 127.0.0.1:3306 as devuser, create spa_setup_check, print the server version, drop the database, and close the connection, and both refuse to start without the password. The Basic version does it all in main and trusts every step after that. The Production-Minded version connects through connectServer, which the Chapter 4 lessons and project reuse, reports a failed connection with its reason and a failed statement with the server's message, starts clean with DROP DATABASE IF EXISTS, and closes the connection with its cleanup form even after an error.</w:t>
       </w:r>
     </w:p>
     <w:p>
@@ -11222,10 +11150,7 @@
     </w:p>
     <w:p>
       <w:r>
-        <w:t xml:space="preserve">Start with the most direct version: main reads SPA_DB_PASSWORD, connects with mysql.connector.connect, makes a cursor, executes CREATE DATABASE, SELECT VERSION(), and DROP DATABASE, prints a line after each step, and closes the cursor and the connection. Like every Basic version in this lesson, it first checks that SPA_DB_PASSWORD is set, so a missing variable never turns into a failed login or a crash. After that, it trusts every step; the Production-Minded version checks them. Every step is commented, so </w:t>
-      </w:r>
-      <w:r>
-        <w:t>read the comments as you type it.</w:t>
+        <w:t>Start with the most direct version: main reads SPA_DB_PASSWORD, connects with mysql.connector.connect, makes a cursor, executes CREATE DATABASE, SELECT VERSION(), and DROP DATABASE, prints a line after each step, and closes the cursor and the connection. Like every Basic version in this lesson, it first checks that SPA_DB_PASSWORD is set, so a missing variable never turns into a failed login or a crash. After that, it trusts every step; the Production-Minded version checks them. Every step is commented, so read the comments as you type it.</w:t>
       </w:r>
     </w:p>
     <w:p>
@@ -12835,10 +12760,7 @@
     </w:p>
     <w:p>
       <w:r>
-        <w:t>Both versions read SPA_DB_PASSWORD, connect to 127.0.0.1:3306 as devuser, create spa_setup_check, print the server version, drop the database, and close the connection, and both refuse to start without the password. The Basic version does it all in main and trusts every step after that. The Production-Minded version connects through connect_server, which the Chapter 4 lessons and project reuse, reports a failed connection with its reason and a failed statement with the server's message, starts clean with DR</w:t>
-      </w:r>
-      <w:r>
-        <w:t>OP DATABASE IF EXISTS, and closes the connection with its cleanup form even after an error.</w:t>
+        <w:t>Both versions read SPA_DB_PASSWORD, connect to 127.0.0.1:3306 as devuser, create spa_setup_check, print the server version, drop the database, and close the connection, and both refuse to start without the password. The Basic version does it all in main and trusts every step after that. The Production-Minded version connects through connect_server, which the Chapter 4 lessons and project reuse, reports a failed connection with its reason and a failed statement with the server's message, starts clean with DROP DATABASE IF EXISTS, and closes the connection with its cleanup form even after an error.</w:t>
       </w:r>
     </w:p>
     <w:p>
@@ -14685,10 +14607,7 @@
     </w:p>
     <w:p>
       <w:r>
-        <w:t>Both versions read SPA_DB_PASSWORD, connect to 127.0.0.1:3306 as devuser, create spa_setup_check, print the server version, drop the database, and close the connection, and both refuse to start without the password. The Basic version does it all in main and trusts every step after that. The Production-Minded version connects through connectServer, which the Chapter 4 lessons and project reuse, reports a failed connection with its reason and a failed statement with the server's message, starts clean with DRO</w:t>
-      </w:r>
-      <w:r>
-        <w:t>P DATABASE IF EXISTS, and closes the connection with its cleanup form even after an error.</w:t>
+        <w:t>Both versions read SPA_DB_PASSWORD, connect to 127.0.0.1:3306 as devuser, create spa_setup_check, print the server version, drop the database, and close the connection, and both refuse to start without the password. The Basic version does it all in main and trusts every step after that. The Production-Minded version connects through connectServer, which the Chapter 4 lessons and project reuse, reports a failed connection with its reason and a failed statement with the server's message, starts clean with DROP DATABASE IF EXISTS, and closes the connection with its cleanup form even after an error.</w:t>
       </w:r>
     </w:p>
     <w:p>
@@ -14716,10 +14635,7 @@
     </w:p>
     <w:p>
       <w:r>
-        <w:t>These are the files the setup commands wrote, shown here so you can check yours. Remember, a project file pins each package to one version, so every learner builds the same thing (Lesson 2.17). Each .csproj names MySqlConnector 2.6.2 in a PackageReference. go.mod names this lesson's Go module, example.com/setupcheck, requires the driver at v1.10.1, and lists filippo.io/edwards25519, a package the driver itself uses, as indirect. package.json names mysql2 3.24.5 under dependencies. Your go line shows your ow</w:t>
-      </w:r>
-      <w:r>
-        <w:t>n Go version, your go.mod marks the driver // indirect too, because go get ran before the .go files existed, and the blank lines and the order of the package.json fields may differ.</w:t>
+        <w:t>These are the files the setup commands wrote, shown here so you can check yours. Remember, a project file pins each package to one version, so every learner builds the same thing (Lesson 2.17). Each .csproj names MySqlConnector 2.6.2 in a PackageReference. go.mod names this lesson's Go module, example.com/setupcheck, requires the driver at v1.10.1, and lists filippo.io/edwards25519, a package the driver itself uses, as indirect. package.json names mysql2 3.24.5 under dependencies. Your go line shows your own Go version, your go.mod marks the driver // indirect too, because go get ran before the .go files existed, and the blank lines and the order of the package.json fields may differ.</w:t>
       </w:r>
     </w:p>
     <w:p>
@@ -15502,10 +15418,7 @@
     </w:p>
     <w:p>
       <w:r>
-        <w:t>The Chapter 4 project, the Database-Backed Contact Manager, keeps its contacts in a MySQL database, spa_contacts, and reaches it through the same connection this lesson sets up: devuser, 127.0.0.1:3306, the password from SPA_DB_PASSWORD, and each language's connector. connect_server (connectServer, ConnectServer) is that piece: it connects as the lesson user and reports a failed connection with its reason, and it connects to the server only, with no database chosen. Lesson 4.2 builds connect_database (conne</w:t>
-      </w:r>
-      <w:r>
-        <w:t>ctDatabase, ConnectDatabase) on top of it, which also chooses the database, and every later lesson and the project start from those two functions.</w:t>
+        <w:t>The Chapter 4 project, the Database-Backed Contact Manager, keeps its contacts in a MySQL database, spa_contacts, and reaches it through the same connection this lesson sets up: devuser, 127.0.0.1:3306, the password from SPA_DB_PASSWORD, and each language's connector. connect_server (connectServer, ConnectServer) is that piece: it connects as the lesson user and reports a failed connection with its reason, and it connects to the server only, with no database chosen. Lesson 4.2 builds connect_database (connectDatabase, ConnectDatabase) on top of it, which also chooses the database, and every later lesson and the project start from those two functions.</w:t>
       </w:r>
     </w:p>
     <w:p>
@@ -15901,10 +15814,7 @@
     </w:p>
     <w:p>
       <w:r>
-        <w:t>MySQL Server runs as a service on this computer and listens on port 3306. root was used once, to create devuser, an account that may use only databases whose names start with spa_; SHOW GRANTS proves it, and CREATE DATABASE spam proves the limit. devuser's password lives in SPA_DB_PASSWORD, never in code, and every program reads it from there. Each language reaches the server through its own connector, installed inside the project and pinned to one version; C and C++ use MySQL's own libraries, with their DL</w:t>
-      </w:r>
-      <w:r>
-        <w:t>Ls next to the programs, and C++ builds with Visual C++ on Windows because its connector is built for it. Every program connected, created spa_setup_check, printed the server's version, and dropped it again, and the Production-Minded versions report a missing password or a failed connection in Lesson 2.11's style and close the connection with Lesson 3.2's cleanup forms. Lesson 4.1 explains what a database holds, and Lesson 4.2 connects to a lesson database by name.</w:t>
+        <w:t>MySQL Server runs as a service on this computer and listens on port 3306. root was used once, to create devuser, an account that may use only databases whose names start with spa_; SHOW GRANTS proves it, and CREATE DATABASE spam proves the limit. devuser's password lives in SPA_DB_PASSWORD, never in code, and every program reads it from there. Each language reaches the server through its own connector, installed inside the project and pinned to one version; C and C++ use MySQL's own libraries, with their DLLs next to the programs, and C++ builds with Visual C++ on Windows because its connector is built for it. Every program connected, created spa_setup_check, printed the server's version, and dropped it again, and the Production-Minded versions report a missing password or a failed connection in Lesson 2.11's style and close the connection with Lesson 3.2's cleanup forms. Lesson 4.1 explains what a database holds, and Lesson 4.2 connects to a lesson database by name.</w:t>
       </w:r>
     </w:p>
     <w:sectPr>

</xml_diff>

<commit_message>
Volume 1, Chapter 4: updated lessons
</commit_message>
<xml_diff>
--- a/Volume 1/Chapter 04 - Databases/SPA_Vol1_Ch4_Lesson4_0_MySQL_Setup.docx
+++ b/Volume 1/Chapter 04 - Databases/SPA_Vol1_Ch4_Lesson4_0_MySQL_Setup.docx
@@ -95,7 +95,10 @@
     </w:p>
     <w:p>
       <w:r>
-        <w:t>Chapter 3 kept data in files that only your program opened. A database server is different: it is a separate program, always running, and your programs reach it over a connection, with a host, a port, a user, and a password. Real systems never connect as the administrator, and never keep the password in the source code, because a bug or a leaked password would then reach everything on the server. Setting this up once, carefully, means every later lesson simply connects; and knowing how the pieces fit lets you fix a failed connection yourself instead of asking someone.</w:t>
+        <w:t>Chapter 3 kept data in files that only your program opened. A database server is different: it is a separate program, always running, and your programs reach it over a connection, with a host, a port, a user, and a password. Real systems never connect as the administrator, and never keep the password in the source code, because a bug or a leaked password would then reach everything on the server. Setting this up once, carefully, means every later lesson simply connects; and knowing how the pieces fit lets y</w:t>
+      </w:r>
+      <w:r>
+        <w:t>ou fix a failed connection yourself instead of asking someone.</w:t>
       </w:r>
     </w:p>
     <w:p>
@@ -183,7 +186,10 @@
         <w:pStyle w:val="ListBullet"/>
       </w:pPr>
       <w:r>
-        <w:t>Remember, a secret is never written into the code or printed (Lesson 2.14). The programs read devuser's password from the SPA_DB_PASSWORD environment variable, which you set once, for your Windows account. A terminal copies the environment when it starts, so only a terminal opened after you set the variable has it. A user environment variable can be read only by your own Windows account and by administrators: good enough for a learning computer, while production systems keep passwords in a secret store, a service built to hand secrets only to the programs allowed to have them.</w:t>
+        <w:t>Remember, a secret is never written into the code or printed (Lesson 2.14). The programs read devuser's password from the SPA_DB_PASSWORD environment variable, which you set once, for your Windows account. A terminal copies the environment when it starts, so only a terminal opened after you set the variable has it. A user environment variable can be read only by your own Windows account and by administrators: good enough for a learning computer, while production systems keep passwords in a secret store, a s</w:t>
+      </w:r>
+      <w:r>
+        <w:t>ervice built to hand secrets only to the programs allowed to have them.</w:t>
       </w:r>
     </w:p>
     <w:p>
@@ -778,7 +784,10 @@
     </w:p>
     <w:p>
       <w:r>
-        <w:t>Download MySQL Community Server 26.7 for Windows (the MSI installer) from MySQL's download page, dev.mysql.com/downloads/mysql; when the page asks you to log in or sign up, choose No thanks, just start my download. Run the installer from your Downloads folder. Windows shows its User Account Control box, as in Lesson 1.1; check the Verified publisher reads Oracle America, Inc. and choose Yes. Choose the Typical setup. When it finishes, it opens MySQL Configurator. Only these choices matter for the course; keep every other default:</w:t>
+        <w:t>Download MySQL Community Server 26.7 for Windows (the MSI installer) from MySQL's download page, dev.mysql.com/downloads/mysql; when the page asks you to log in or sign up, choose No thanks, just start my download. Run the installer from your Downloads folder. Windows shows its User Account Control box, as in Lesson 1.1; check the Verified publisher reads Oracle America, Inc. and choose Yes. Choose the Typical setup. When it finishes, it opens MySQL Configurator. Only these choices matter for the course; ke</w:t>
+      </w:r>
+      <w:r>
+        <w:t>ep every other default:</w:t>
       </w:r>
     </w:p>
     <w:p>
@@ -1280,7 +1289,10 @@
     </w:p>
     <w:p>
       <w:r>
-        <w:t>Now connect as devuser from the command line and do what every program in this lesson does: show its rights, create spa_setup_check, ask for the server's version, and drop the database again. -u names the user, -h the host, and -P (a capital P) the port. -p makes the client ask for devuser's password; type it and press Enter (nothing shows as you type). -e runs the statements in $checks and ends the client, and -t prints each answer as a table. The ` at the end of the $checks line continues it on the next line, and + joins the two pieces of text into one.</w:t>
+        <w:t>Now connect as devuser from the command line and do what every program in this lesson does: show its rights, create spa_setup_check, ask for the server's version, and drop the database again. -u names the user, -h the host, and -P (a capital P) the port. -p makes the client ask for devuser's password; type it and press Enter (nothing shows as you type). -e runs the statements in $checks and ends the client, and -t prints each answer as a table. The ` at the end of the $checks line continues it on the next l</w:t>
+      </w:r>
+      <w:r>
+        <w:t>ine, and + joins the two pieces of text into one.</w:t>
       </w:r>
     </w:p>
     <w:p>
@@ -1658,7 +1670,10 @@
     </w:p>
     <w:p>
       <w:r>
-        <w:t>Only the C++ programs need this step. On Windows, install Visual Studio Build Tools 2026 from visualstudio.microsoft.com/downloads (under Tools for Visual Studio) and choose the Desktop development with C++ workload. Windows shows its User Account Control box, as in Lesson 1.1; check the Verified publisher reads Microsoft Corporation and choose Yes. Then install MySQL Connector/C++ 26.7 for Windows, x86 64-bit (the MSI installer), from dev.mysql.com/downloads/connector/cpp; it installs into C:\Program Files\MySQL\MySQL Connector C++ 26.7. Its User Account Control box shows the Verified publisher Oracle America, Inc., as MySQL Server's did; choose Yes. The C++ Implementation section explains why C++ uses Visual C++ for database lessons on Windows, and its build commands check both installs.</w:t>
+        <w:t>Only the C++ programs need this step. On Windows, install Visual Studio Build Tools 2026 from visualstudio.microsoft.com/downloads (under Tools for Visual Studio) and choose the Desktop development with C++ workload. Windows shows its User Account Control box, as in Lesson 1.1; check the Verified publisher reads Microsoft Corporation and choose Yes. Then install MySQL Connector/C++ 26.7 for Windows, x86 64-bit (the MSI installer), from dev.mysql.com/downloads/connector/cpp; it installs into C:\Program Files</w:t>
+      </w:r>
+      <w:r>
+        <w:t>\MySQL\MySQL Connector C++ 26.7. Its User Account Control box shows the Verified publisher Oracle America, Inc., as MySQL Server's did; choose Yes. The C++ Implementation section explains why C++ uses Visual C++ for database lessons on Windows, and its build commands check both installs.</w:t>
       </w:r>
     </w:p>
     <w:p>
@@ -1841,7 +1856,10 @@
         <w:keepNext/>
       </w:pPr>
       <w:r>
-        <w:t>Next, let the tools create each project's settings file, as in Chapter 1 and Lesson 2.17. Remember, dotnet new console -o makes a C# project in the folder -o names, with a .csproj file and a Program.cs. The starter Program.cs only prints Hello, World!; you replace it with this lesson's code in the C# section. Remember, dotnet add package writes the pinned PackageReference into the .csproj, and the package is downloaded into your NuGet cache: here MySqlConnector 2.6.2, once for each C# project. Remember, go mod init makes the .\go folder a module by writing .\go\go.mod, and go get pins the module in go.mod and go.sum: here the MySQL driver at v1.10.1. The go line shows the Go version you have installed. No .go file imports the driver yet, so go get marks it // indirect; the build works either way.</w:t>
+        <w:t xml:space="preserve">Next, let the tools create each project's settings file, as in Chapter 1 and Lesson 2.17. Remember, dotnet new console -o makes a C# project in the folder -o names, with a .csproj file and a Program.cs. The starter Program.cs only prints Hello, World!; you replace it with this lesson's code in the C# section. Remember, dotnet add package writes the pinned PackageReference into the .csproj, and the package is downloaded into your NuGet cache: here MySqlConnector 2.6.2, once for each C# project. Remember, go </w:t>
+      </w:r>
+      <w:r>
+        <w:t>mod init makes the .\go folder a module by writing .\go\go.mod, and go get pins the module in go.mod and go.sum: here the MySQL driver at v1.10.1. The go line shows the Go version you have installed. No .go file imports the driver yet, so go get marks it // indirect; the build works either way.</w:t>
       </w:r>
     </w:p>
     <w:p>
@@ -2756,17 +2774,23 @@
         <w:pStyle w:val="ListBullet"/>
       </w:pPr>
       <w:r>
-        <w:t>database exists (error 1007): an earlier run stopped partway and left spa_setup_check behind. The C++, C#, Python, and TypeScript Basic programs stop with this message; the C and Go Basic programs ignore a failed statement and carry on, and the Production-Minded programs start with DROP DATABASE IF EXISTS, so they clean up by themselves. To remove it, run &amp; $mysql -u devuser -h 127.0.0.1 -P 3306 -p -e "DROP DATABASE spa_setup_check" (on Linux or macOS, start it with mysql instead of &amp; $mysql), then run the program again.</w:t>
-      </w:r>
-    </w:p>
-    <w:p>
-      <w:pPr>
-        <w:keepNext/>
-      </w:pPr>
-    </w:p>
-    <w:p>
-      <w:r>
-        <w:t>Each Production-Minded program also has a Missing Password Check, which runs it without SPA_DB_PASSWORD on purpose. On Windows, the first line keeps the password in $savedPassword, a variable of this terminal only; Remove-Item Env:SPA_DB_PASSWORD removes the variable from this terminal's environment, the program runs, $LASTEXITCODE shows its exit code, and the last line puts the variable back. On Linux or macOS, env -u SPA_DB_PASSWORD runs one program with the variable removed from that program's own copy of the environment, so there is nothing to restore. Nothing outside the terminal changes, nothing prints the password, and the program stops before it tries to connect, so it makes no failed login attempt.</w:t>
+        <w:t xml:space="preserve">database exists (error 1007): an earlier run stopped partway and left spa_setup_check behind. The C++, C#, Python, and TypeScript Basic programs stop with this message; the C and Go Basic programs ignore a failed statement and carry on, and the Production-Minded programs start with DROP DATABASE IF EXISTS, so they clean up by themselves. To remove it, run &amp; $mysql -u devuser -h 127.0.0.1 -P 3306 -p -e "DROP DATABASE spa_setup_check" (on Linux or macOS, start it with mysql instead of &amp; $mysql), then run the </w:t>
+      </w:r>
+      <w:r>
+        <w:t>program again.</w:t>
+      </w:r>
+    </w:p>
+    <w:p>
+      <w:pPr>
+        <w:keepNext/>
+      </w:pPr>
+    </w:p>
+    <w:p>
+      <w:r>
+        <w:t>Each Production-Minded program also has a Missing Password Check, which runs it without SPA_DB_PASSWORD on purpose. On Windows, the first line keeps the password in $savedPassword, a variable of this terminal only; Remove-Item Env:SPA_DB_PASSWORD removes the variable from this terminal's environment, the program runs, $LASTEXITCODE shows its exit code, and the last line puts the variable back. On Linux or macOS, env -u SPA_DB_PASSWORD runs one program with the variable removed from that program's own copy o</w:t>
+      </w:r>
+      <w:r>
+        <w:t>f the environment, so there is nothing to restore. Nothing outside the terminal changes, nothing prints the password, and the program stops before it tries to connect, so it makes no failed login attempt.</w:t>
       </w:r>
     </w:p>
     <w:p>
@@ -3066,7 +3090,10 @@
     </w:p>
     <w:p>
       <w:r>
-        <w:t>C talks to MySQL through MySQL's C API, the client library that comes with MySQL Server. Remember, a header declares and a library provides, and the build command names where they are (Lesson 2.17): -I adds MySQL's include folder, where mysql.h is; -L adds its lib folder; and -lmysql links libmysql.lib, which connects the program to libmysql.dll. Remember also that a DLL must sit next to the program or on its search path: libmysql.dll and the two OpenSSL DLLs it uses to encrypt the connection, libssl-3-x64.dll and libcrypto-3-x64.dll, are the three files the Library Setup copied into the c folder. The C API is plain C, so gcc can use it even though MySQL built it with Visual C++.</w:t>
+        <w:t>C talks to MySQL through MySQL's C API, the client library that comes with MySQL Server. Remember, a header declares and a library provides, and the build command names where they are (Lesson 2.17): -I adds MySQL's include folder, where mysql.h is; -L adds its lib folder; and -lmysql links libmysql.lib, which connects the program to libmysql.dll. Remember also that a DLL must sit next to the program or on its search path: libmysql.dll and the two OpenSSL DLLs it uses to encrypt the connection, libssl-3-x64.</w:t>
+      </w:r>
+      <w:r>
+        <w:t>dll and libcrypto-3-x64.dll, are the three files the Library Setup copied into the c folder. The C API is plain C, so gcc can use it even though MySQL built it with Visual C++.</w:t>
       </w:r>
     </w:p>
     <w:p>
@@ -3089,7 +3116,10 @@
     </w:p>
     <w:p>
       <w:r>
-        <w:t>Start with the most direct version: main reads SPA_DB_PASSWORD, creates a connection handle with mysql_init, connects with mysql_real_connect, sends CREATE DATABASE, SELECT VERSION(), and DROP DATABASE with mysql_query, prints a line after each step, and closes the connection. Like every Basic version in this lesson, it first checks that SPA_DB_PASSWORD is set, so a missing variable never turns into a failed login or a crash. Even this Basic version checks mysql_real_connect's result, because using a handle that never connected would fail at every later step and crash at mysql_fetch_row. Every step is commented, so read the comments as you type it.</w:t>
+        <w:t>Start with the most direct version: main reads SPA_DB_PASSWORD, creates a connection handle with mysql_init, connects with mysql_real_connect, sends CREATE DATABASE, SELECT VERSION(), and DROP DATABASE with mysql_query, prints a line after each step, and closes the connection. Like every Basic version in this lesson, it first checks that SPA_DB_PASSWORD is set, so a missing variable never turns into a failed login or a crash. Even this Basic version checks mysql_real_connect's result, because using a handle</w:t>
+      </w:r>
+      <w:r>
+        <w:t xml:space="preserve"> that never connected would fail at every later step and crash at mysql_fetch_row. Every step is commented, so read the comments as you type it.</w:t>
       </w:r>
     </w:p>
     <w:p>
@@ -3274,23 +3304,23 @@
         <w:pStyle w:val="SourceCode"/>
       </w:pPr>
       <w:r>
-        <w:t xml:space="preserve">    // mysql_init creates an empty connection handle, a MYSQL *, which</w:t>
-      </w:r>
-    </w:p>
-    <w:p>
-      <w:pPr>
-        <w:pStyle w:val="SourceCode"/>
-      </w:pPr>
-      <w:r>
-        <w:t xml:space="preserve">    // every other MySQL function uses to reach the server, the way a</w:t>
-      </w:r>
-    </w:p>
-    <w:p>
-      <w:pPr>
-        <w:pStyle w:val="SourceCode"/>
-      </w:pPr>
-      <w:r>
-        <w:t xml:space="preserve">    // FILE * reaches a file.</w:t>
+        <w:t xml:space="preserve">    // mysql_init creates an empty connection handle, a MYSQL *; NULL</w:t>
+      </w:r>
+    </w:p>
+    <w:p>
+      <w:pPr>
+        <w:pStyle w:val="SourceCode"/>
+      </w:pPr>
+      <w:r>
+        <w:t xml:space="preserve">    // asks it for a new one. Every other MySQL function uses the handle to</w:t>
+      </w:r>
+    </w:p>
+    <w:p>
+      <w:pPr>
+        <w:pStyle w:val="SourceCode"/>
+      </w:pPr>
+      <w:r>
+        <w:t xml:space="preserve">    // reach the server, the way a FILE * reaches a file.</w:t>
       </w:r>
     </w:p>
     <w:p>
@@ -3875,7 +3905,10 @@
     </w:p>
     <w:p>
       <w:r>
-        <w:t>The Production-Minded version prints the same lines. It starts with DROP DATABASE IF EXISTS spa_setup_check, which drops the test database only if an earlier run left it behind, so every run starts clean. connect_server returns 0, or -1 when the connection fails; main then prints the two Error lines with mysql_error's reason, closes the handle, and returns 1. run_statement sends one statement and prints one Error line when the server refuses it, and check_setup returns -1 at the first step that fails. main closes the connection once, after check_setup, whatever it returned.</w:t>
+        <w:t xml:space="preserve">The Production-Minded version prints the same lines. It starts with DROP DATABASE IF EXISTS spa_setup_check, which drops the test database only if an earlier run left it behind, so every run starts clean. connect_server returns 0, or -1 when the connection fails; main then prints the two Error lines with mysql_error's reason, closes the handle, and returns 1. run_statement sends one statement and prints one Error line when the server refuses it, and check_setup returns -1 at the first step that fails. main </w:t>
+      </w:r>
+      <w:r>
+        <w:t>closes the connection once, after check_setup, whatever it returned.</w:t>
       </w:r>
     </w:p>
     <w:p>
@@ -5112,7 +5145,10 @@
     </w:p>
     <w:p>
       <w:r>
-        <w:t>Both versions read SPA_DB_PASSWORD, connect to 127.0.0.1:3306 as devuser, create spa_setup_check, print the server version, drop the database, and close the connection, and both refuse to start without the password. The Basic version does it all in main and trusts every step after that. The Production-Minded version connects through connect_server, which the Chapter 4 lessons and project reuse, reports a failed connection with its reason and a failed statement with the server's message, starts clean with DROP DATABASE IF EXISTS, and closes the connection with its cleanup form even after an error.</w:t>
+        <w:t>Both versions read SPA_DB_PASSWORD, connect to 127.0.0.1:3306 as devuser, create spa_setup_check, print the server version, drop the database, and close the connection, and both refuse to start without the password. The Basic version does it all in main and trusts every step after that. The Production-Minded version connects through connect_server, which the Chapter 4 lessons and project reuse, reports a failed connection with its reason and a failed statement with the server's message, starts clean with DR</w:t>
+      </w:r>
+      <w:r>
+        <w:t>OP DATABASE IF EXISTS, and closes the connection with its cleanup form even after an error.</w:t>
       </w:r>
     </w:p>
     <w:p>
@@ -5140,7 +5176,10 @@
     </w:p>
     <w:p>
       <w:r>
-        <w:t>C++ uses MySQL Connector/C++ 26.7 and its classic API, the one modeled on Java's database API (JDBC): a driver opens a sql::Connection, a sql::Statement sends SQL, and a sql::ResultSet holds returned rows. On Windows, this chapter builds the C++ programs with Visual C++, Microsoft's compiler, instead of g++. The connector's Windows files are built with Visual C++, and C++ libraries from the two compilers cannot be mixed: they lay out objects such as std::string differently, so a g++ program cannot use the connector's DLL. The same source builds with g++ on Linux, where the packaged connector is built for g++, and every other lesson in the course stays with g++. Remember, a DLL must sit next to the program (Lesson 2.17): the Library Setup copied mysqlcppconn-10-vs14.dll and its two OpenSSL DLLs into the cpp folder.</w:t>
+        <w:t>C++ uses MySQL Connector/C++ 26.7 and its classic API, the one modeled on Java's database API (JDBC): a driver opens a sql::Connection, a sql::Statement sends SQL, and a sql::ResultSet holds returned rows. On Windows, this chapter builds the C++ programs with Visual C++, Microsoft's compiler, instead of g++. The connector's Windows files are built with Visual C++, and C++ libraries from the two compilers cannot be mixed: they lay out objects such as std::string differently, so a g++ program cannot use the c</w:t>
+      </w:r>
+      <w:r>
+        <w:t>onnector's DLL. The same source builds with g++ on Linux, where the packaged connector is built for g++, and every other lesson in the course stays with g++. Remember, a DLL must sit next to the program (Lesson 2.17): the Library Setup copied mysqlcppconn-10-vs14.dll and its two OpenSSL DLLs into the cpp folder.</w:t>
       </w:r>
     </w:p>
     <w:p>
@@ -5163,7 +5202,10 @@
     </w:p>
     <w:p>
       <w:r>
-        <w:t>Start with the most direct version: main reads SPA_DB_PASSWORD, connects through the driver, keeps the connection, the statement, and the rows in std::unique_ptr objects, sends CREATE DATABASE, SELECT VERSION(), and DROP DATABASE, and prints a line after each step. Like every Basic version in this lesson, it first checks that SPA_DB_PASSWORD is set, so a missing variable never turns into a failed login or a crash. After that, it trusts every step; the Production-Minded version checks them. Every step is commented, so read the comments as you type it.</w:t>
+        <w:t>Start with the most direct version: main reads SPA_DB_PASSWORD, connects through the driver, keeps the connection, the statement, and the rows in std::unique_ptr objects, sends CREATE DATABASE, SELECT VERSION(), and DROP DATABASE, and prints a line after each step. Like every Basic version in this lesson, it first checks that SPA_DB_PASSWORD is set, so a missing variable never turns into a failed login or a crash. After that, it trusts every step; the Production-Minded version checks them. Every step is com</w:t>
+      </w:r>
+      <w:r>
+        <w:t>mented, so read the comments as you type it.</w:t>
       </w:r>
     </w:p>
     <w:p>
@@ -5729,7 +5771,10 @@
     </w:p>
     <w:p>
       <w:r>
-        <w:t>The first two commands turn this terminal into a Developer PowerShell: Launch-VsDevShell, from the Build Tools, puts cl, the Visual C++ compiler, on PATH for this terminal only, and -Arch amd64 picks 64-bit programs. Run them once in each new terminal. cl's options match the g++ ones you know: /std:c++20 is -std=c++20; /W4 /WX turn on the warnings and make them errors; /EHsc turns on standard C++ exceptions; /MD uses the same C++ runtime DLL the connector uses; /external:I adds the connector's include folder, as -I would, and /external:W0 hides warnings inside those headers only; /Fo:cpp\ and /Fe: name the object file's folder and the program; /link /LIBPATH: is -L, and mysqlcppconn.lib is -lmysqlcppconn. /D_CRT_SECURE_NO_WARNINGS turns off one Visual C++ warning: it calls std::getenv unsafe and suggests _dupenv_s, which only Visual C++ has, while std::getenv is standard C++ and safe for reading one variable.</w:t>
+        <w:t>The first two commands turn this terminal into a Developer PowerShell: Launch-VsDevShell, from the Build Tools, puts cl, the Visual C++ compiler, on PATH for this terminal only, and -Arch amd64 picks 64-bit programs. Run them once in each new terminal. cl's options match the g++ ones you know: /std:c++20 is -std=c++20; /W4 /WX turn on the warnings and make them errors; /EHsc turns on standard C++ exceptions; /MD uses the same C++ runtime DLL the connector uses; /external:I adds the connector's include folde</w:t>
+      </w:r>
+      <w:r>
+        <w:t>r, as -I would, and /external:W0 hides warnings inside those headers only; /Fo:cpp\ and /Fe: name the object file's folder and the program; /link /LIBPATH: is -L, and mysqlcppconn.lib is -lmysqlcppconn. /D_CRT_SECURE_NO_WARNINGS turns off one Visual C++ warning: it calls std::getenv unsafe and suggests _dupenv_s, which only Visual C++ has, while std::getenv is standard C++ and safe for reading one variable.</w:t>
       </w:r>
     </w:p>
     <w:p>
@@ -5884,7 +5929,10 @@
         <w:pStyle w:val="ListBullet"/>
       </w:pPr>
       <w:r>
-        <w:t>If nothing prints at all and the exit code is -1073741515, a DLL is missing from the cpp folder: rerun the Library Setup. If PowerShell shows an error that includes The term 'cl' is not recognized, the Launch-VsDevShell line did not run in this terminal. If the program stops early without a word and the exit code is -1073740791 (0xC0000409), the connector threw an exception that this Basic version does not catch, and a Visual C++ program then ends silently. Run the Production-Minded program: it catches the exception and prints the reason, such as Access denied when SPA_DB_PASSWORD holds a different password from the one CREATE USER set.</w:t>
+        <w:t xml:space="preserve">If nothing prints at all and the exit code is -1073741515, a DLL is missing from the cpp folder: rerun the Library Setup. If PowerShell shows an error that includes The term 'cl' is not recognized, the Launch-VsDevShell line did not run in this terminal. If the program stops early without a word and the exit code is -1073740791 (0xC0000409), the connector threw an exception that this Basic version does not catch, and a Visual C++ program then ends silently. Run the Production-Minded program: it catches the </w:t>
+      </w:r>
+      <w:r>
+        <w:t>exception and prints the reason, such as Access denied when SPA_DB_PASSWORD holds a different password from the one CREATE USER set.</w:t>
       </w:r>
     </w:p>
     <w:p>
@@ -5923,7 +5971,10 @@
     </w:p>
     <w:p>
       <w:r>
-        <w:t>The Production-Minded version prints the same lines. It starts with DROP DATABASE IF EXISTS spa_setup_check, which drops the test database only if an earlier run left it behind, so every run starts clean. connectServer returns the connection in a std::unique_ptr, or throws a std::runtime_error with the server and the connector's reason when it cannot connect. checkSetup sends the statements; a statement the server refuses throws an sql::SQLException. main's one catch reports either kind as one Error line, and the destructors close the statement and the connection on the way out.</w:t>
+        <w:t>The Production-Minded version prints the same lines. It starts with DROP DATABASE IF EXISTS spa_setup_check, which drops the test database only if an earlier run left it behind, so every run starts clean. connectServer returns the connection in a std::unique_ptr, or throws a std::runtime_error with the server and the connector's reason when it cannot connect. checkSetup sends the statements; a statement the server refuses throws an sql::SQLException. main's one catch reports either kind as one Error line, a</w:t>
+      </w:r>
+      <w:r>
+        <w:t>nd the destructors close the statement and the connection on the way out.</w:t>
       </w:r>
     </w:p>
     <w:p>
@@ -6076,7 +6127,7 @@
         <w:pStyle w:val="SourceCode"/>
       </w:pPr>
       <w:r>
-        <w:t>// ends.</w:t>
+        <w:t>// ends, and const &amp; reads password without a copy.</w:t>
       </w:r>
     </w:p>
     <w:p>
@@ -6201,15 +6252,15 @@
         <w:pStyle w:val="SourceCode"/>
       </w:pPr>
       <w:r>
-        <w:t>// database again. A failed statement throws an sql::SQLException, which</w:t>
-      </w:r>
-    </w:p>
-    <w:p>
-      <w:pPr>
-        <w:pStyle w:val="SourceCode"/>
-      </w:pPr>
-      <w:r>
-        <w:t>// leaves the function at once.</w:t>
+        <w:t>// database again. Remember, &amp; makes connection the caller's own, not a</w:t>
+      </w:r>
+    </w:p>
+    <w:p>
+      <w:pPr>
+        <w:pStyle w:val="SourceCode"/>
+      </w:pPr>
+      <w:r>
+        <w:t>// copy. A failed statement throws an sql::SQLException and leaves at once.</w:t>
       </w:r>
     </w:p>
     <w:p>
@@ -7019,7 +7070,10 @@
     </w:p>
     <w:p>
       <w:r>
-        <w:t>Both versions read SPA_DB_PASSWORD, connect to 127.0.0.1:3306 as devuser, create spa_setup_check, print the server version, drop the database, and close the connection, and both refuse to start without the password. The Basic version does it all in main and trusts every step after that. The Production-Minded version connects through connectServer, which the Chapter 4 lessons and project reuse, reports a failed connection with its reason and a failed statement with the server's message, starts clean with DROP DATABASE IF EXISTS, and closes the connection with its cleanup form even after an error.</w:t>
+        <w:t>Both versions read SPA_DB_PASSWORD, connect to 127.0.0.1:3306 as devuser, create spa_setup_check, print the server version, drop the database, and close the connection, and both refuse to start without the password. The Basic version does it all in main and trusts every step after that. The Production-Minded version connects through connectServer, which the Chapter 4 lessons and project reuse, reports a failed connection with its reason and a failed statement with the server's message, starts clean with DRO</w:t>
+      </w:r>
+      <w:r>
+        <w:t>P DATABASE IF EXISTS, and closes the connection with its cleanup form even after an error.</w:t>
       </w:r>
     </w:p>
     <w:p>
@@ -7070,7 +7124,10 @@
     </w:p>
     <w:p>
       <w:r>
-        <w:t>Start with the most direct version: Main reads SPA_DB_PASSWORD, collects the settings in a MySqlConnectionStringBuilder, opens a MySqlConnection, runs CREATE DATABASE, SELECT VERSION(), and DROP DATABASE as MySqlCommands, and prints a line after each step. Like every Basic version in this lesson, it first checks that SPA_DB_PASSWORD is set, so a missing variable never turns into a failed login or a crash. After that, it trusts every step; the Production-Minded version checks them. Every step is commented, so read the comments as you type it.</w:t>
+        <w:t>Start with the most direct version: Main reads SPA_DB_PASSWORD, collects the settings in a MySqlConnectionStringBuilder, opens a MySqlConnection, runs CREATE DATABASE, SELECT VERSION(), and DROP DATABASE as MySqlCommands, and prints a line after each step. Like every Basic version in this lesson, it first checks that SPA_DB_PASSWORD is set, so a missing variable never turns into a failed login or a crash. After that, it trusts every step; the Production-Minded version checks them. Every step is commented, s</w:t>
+      </w:r>
+      <w:r>
+        <w:t>o read the comments as you type it.</w:t>
       </w:r>
     </w:p>
     <w:p>
@@ -7831,7 +7888,10 @@
     </w:p>
     <w:p>
       <w:r>
-        <w:t>The Production-Minded version prints the same lines. It starts with DROP DATABASE IF EXISTS spa_setup_check, which drops the test database only if an earlier run left it behind, so every run starts clean. ConnectServer opens and returns the connection, or throws an Exception with the server and the connector's reason. RunStatement sends one statement that returns no rows, and CheckSetup runs the steps. Main's one catch reports either kind of failure as one Error line, and using closes the connection on the way out.</w:t>
+        <w:t xml:space="preserve">The Production-Minded version prints the same lines. It starts with DROP DATABASE IF EXISTS spa_setup_check, which drops the test database only if an earlier run left it behind, so every run starts clean. ConnectServer opens and returns the connection, or throws an Exception with the server and the connector's reason. RunStatement sends one statement that returns no rows, and CheckSetup runs the steps. Main's one catch reports either kind of failure as one Error line, and using closes the connection on the </w:t>
+      </w:r>
+      <w:r>
+        <w:t>way out.</w:t>
       </w:r>
     </w:p>
     <w:p>
@@ -8088,23 +8148,23 @@
         <w:pStyle w:val="SourceCode"/>
       </w:pPr>
       <w:r>
-        <w:t xml:space="preserve">            // The connection never opened, so Dispose only releases the</w:t>
-      </w:r>
-    </w:p>
-    <w:p>
-      <w:pPr>
-        <w:pStyle w:val="SourceCode"/>
-      </w:pPr>
-      <w:r>
-        <w:t xml:space="preserve">            // object. The new Exception names the server, and \n puts the</w:t>
-      </w:r>
-    </w:p>
-    <w:p>
-      <w:pPr>
-        <w:pStyle w:val="SourceCode"/>
-      </w:pPr>
-      <w:r>
-        <w:t xml:space="preserve">            // reason on a line of its own.</w:t>
+        <w:t xml:space="preserve">            // Dispose, the call using makes when its block ends, releases</w:t>
+      </w:r>
+    </w:p>
+    <w:p>
+      <w:pPr>
+        <w:pStyle w:val="SourceCode"/>
+      </w:pPr>
+      <w:r>
+        <w:t xml:space="preserve">            // the connection, which never opened. The new Exception names</w:t>
+      </w:r>
+    </w:p>
+    <w:p>
+      <w:pPr>
+        <w:pStyle w:val="SourceCode"/>
+      </w:pPr>
+      <w:r>
+        <w:t xml:space="preserve">            // the server, and \n puts the reason on a line of its own.</w:t>
       </w:r>
     </w:p>
     <w:p>
@@ -8478,23 +8538,23 @@
         <w:pStyle w:val="SourceCode"/>
       </w:pPr>
       <w:r>
-        <w:t xml:space="preserve">        // Remember, a throw skips the lines below it and lands in the</w:t>
-      </w:r>
-    </w:p>
-    <w:p>
-      <w:pPr>
-        <w:pStyle w:val="SourceCode"/>
-      </w:pPr>
-      <w:r>
-        <w:t xml:space="preserve">        // catch. using closes the connection when the try block ends, even</w:t>
-      </w:r>
-    </w:p>
-    <w:p>
-      <w:pPr>
-        <w:pStyle w:val="SourceCode"/>
-      </w:pPr>
-      <w:r>
-        <w:t xml:space="preserve">        // when an exception leaves it early.</w:t>
+        <w:t xml:space="preserve">        // Remember, a throw lands in the catch. MySqlException is a kind of</w:t>
+      </w:r>
+    </w:p>
+    <w:p>
+      <w:pPr>
+        <w:pStyle w:val="SourceCode"/>
+      </w:pPr>
+      <w:r>
+        <w:t xml:space="preserve">        // Exception, so one catch reports both kinds. using closes the</w:t>
+      </w:r>
+    </w:p>
+    <w:p>
+      <w:pPr>
+        <w:pStyle w:val="SourceCode"/>
+      </w:pPr>
+      <w:r>
+        <w:t xml:space="preserve">        // connection when the try block ends, even after an exception.</w:t>
       </w:r>
     </w:p>
     <w:p>
@@ -8999,7 +9059,10 @@
     </w:p>
     <w:p>
       <w:r>
-        <w:t>Both versions read SPA_DB_PASSWORD, connect to 127.0.0.1:3306 as devuser, create spa_setup_check, print the server version, drop the database, and close the connection, and both refuse to start without the password. The Basic version does it all in Main and trusts every step after that. The Production-Minded version connects through ConnectServer, which the Chapter 4 lessons and project reuse, reports a failed connection with its reason and a failed statement with the server's message, starts clean with DROP DATABASE IF EXISTS, and closes the connection with its cleanup form even after an error.</w:t>
+        <w:t>Both versions read SPA_DB_PASSWORD, connect to 127.0.0.1:3306 as devuser, create spa_setup_check, print the server version, drop the database, and close the connection, and both refuse to start without the password. The Basic version does it all in Main and trusts every step after that. The Production-Minded version connects through ConnectServer, which the Chapter 4 lessons and project reuse, reports a failed connection with its reason and a failed statement with the server's message, starts clean with DRO</w:t>
+      </w:r>
+      <w:r>
+        <w:t>P DATABASE IF EXISTS, and closes the connection with its cleanup form even after an error.</w:t>
       </w:r>
     </w:p>
     <w:p>
@@ -9027,7 +9090,10 @@
     </w:p>
     <w:p>
       <w:r>
-        <w:t>Go has a database package in its standard library, database/sql, which talks to every database through a driver: github.com/go-sql-driver/mysql is MySQL's. Remember, go.mod's require line pins the driver's version, and go mod tidy downloaded it and recorded its checksums in go.sum (Lesson 2.17). sql.Open returns a *sql.DB, a pool: it opens connections when they are needed and reuses them, so sql.Open itself does not connect. Ping connects now, which is how the program finds out at once whether the server can be reached.</w:t>
+        <w:t>Go has a database package in its standard library, database/sql, which talks to every database through a driver: github.com/go-sql-driver/mysql is MySQL's. Remember, go.mod's require line pins the driver's version, and go mod tidy downloaded it and recorded its checksums in go.sum (Lesson 2.17). sql.Open returns a *sql.DB, a pool: it opens connections when they are needed and reuses them, so sql.Open itself does not connect. Ping connects now, which is how the program finds out at once whether the server ca</w:t>
+      </w:r>
+      <w:r>
+        <w:t>n be reached.</w:t>
       </w:r>
     </w:p>
     <w:p>
@@ -9050,7 +9116,10 @@
     </w:p>
     <w:p>
       <w:r>
-        <w:t>Start with the most direct version: main reads SPA_DB_PASSWORD, fills the driver's settings record, opens the pool with sql.Open, connects with Ping, runs CREATE DATABASE and DROP DATABASE with Exec and SELECT VERSION() with QueryRow, prints a line after each step, and closes the pool. Like every Basic version in this lesson, it first checks that SPA_DB_PASSWORD is set, so a missing variable never turns into a failed login or a crash. Like the C version, it also checks the error values of sql.Open and Ping, because without a connection every later step would silently do nothing; after that, it trusts every step. Every step is commented, so read the comments as you type it.</w:t>
+        <w:t>Start with the most direct version: main reads SPA_DB_PASSWORD, fills the driver's settings record, opens the pool with sql.Open, connects with Ping, runs CREATE DATABASE and DROP DATABASE with Exec and SELECT VERSION() with QueryRow, prints a line after each step, and closes the pool. Like every Basic version in this lesson, it first checks that SPA_DB_PASSWORD is set, so a missing variable never turns into a failed login or a crash. Like the C version, it also checks the error values of sql.Open and Ping,</w:t>
+      </w:r>
+      <w:r>
+        <w:t xml:space="preserve"> because without a connection every later step would silently do nothing; after that, it trusts every step. Every step is commented, so read the comments as you type it.</w:t>
       </w:r>
     </w:p>
     <w:p>
@@ -9363,31 +9432,31 @@
         <w:pStyle w:val="SourceCode"/>
       </w:pPr>
       <w:r>
-        <w:t xml:space="preserve">    // are needed; it does not connect yet. Ping connects now. Without a</w:t>
-      </w:r>
-    </w:p>
-    <w:p>
-      <w:pPr>
-        <w:pStyle w:val="SourceCode"/>
-      </w:pPr>
-      <w:r>
-        <w:t xml:space="preserve">    // connection every later step would silently do nothing, so even this</w:t>
-      </w:r>
-    </w:p>
-    <w:p>
-      <w:pPr>
-        <w:pStyle w:val="SourceCode"/>
-      </w:pPr>
-      <w:r>
-        <w:t xml:space="preserve">    // Basic version checks both error values. Remember, err is nil when</w:t>
-      </w:r>
-    </w:p>
-    <w:p>
-      <w:pPr>
-        <w:pStyle w:val="SourceCode"/>
-      </w:pPr>
-      <w:r>
-        <w:t xml:space="preserve">    // the step worked.</w:t>
+        <w:t xml:space="preserve">    // are needed; "mysql" names the driver, which the imported package</w:t>
+      </w:r>
+    </w:p>
+    <w:p>
+      <w:pPr>
+        <w:pStyle w:val="SourceCode"/>
+      </w:pPr>
+      <w:r>
+        <w:t xml:space="preserve">    // registers under that name. It does not connect yet; Ping connects now.</w:t>
+      </w:r>
+    </w:p>
+    <w:p>
+      <w:pPr>
+        <w:pStyle w:val="SourceCode"/>
+      </w:pPr>
+      <w:r>
+        <w:t xml:space="preserve">    // Without a connection every later step would silently do nothing, so</w:t>
+      </w:r>
+    </w:p>
+    <w:p>
+      <w:pPr>
+        <w:pStyle w:val="SourceCode"/>
+      </w:pPr>
+      <w:r>
+        <w:t xml:space="preserve">    // even this Basic version checks both. Remember, err is nil if it worked.</w:t>
       </w:r>
     </w:p>
     <w:p>
@@ -9488,23 +9557,23 @@
         <w:pStyle w:val="SourceCode"/>
       </w:pPr>
       <w:r>
-        <w:t xml:space="preserve">    // Exec runs a statement that returns no rows. CREATE DATABASE makes a</w:t>
-      </w:r>
-    </w:p>
-    <w:p>
-      <w:pPr>
-        <w:pStyle w:val="SourceCode"/>
-      </w:pPr>
-      <w:r>
-        <w:t xml:space="preserve">    // new, empty database; devuser may create it because its name starts</w:t>
-      </w:r>
-    </w:p>
-    <w:p>
-      <w:pPr>
-        <w:pStyle w:val="SourceCode"/>
-      </w:pPr>
-      <w:r>
-        <w:t xml:space="preserve">    // with spa_.</w:t>
+        <w:t xml:space="preserve">    // Exec runs a statement that returns no rows; from here on this Basic</w:t>
+      </w:r>
+    </w:p>
+    <w:p>
+      <w:pPr>
+        <w:pStyle w:val="SourceCode"/>
+      </w:pPr>
+      <w:r>
+        <w:t xml:space="preserve">    // version leaves the error values unchecked. CREATE DATABASE makes a</w:t>
+      </w:r>
+    </w:p>
+    <w:p>
+      <w:pPr>
+        <w:pStyle w:val="SourceCode"/>
+      </w:pPr>
+      <w:r>
+        <w:t xml:space="preserve">    // new, empty database; devuser may create it: its name starts with spa_.</w:t>
       </w:r>
     </w:p>
     <w:p>
@@ -10225,15 +10294,15 @@
         <w:pStyle w:val="SourceCode"/>
       </w:pPr>
       <w:r>
-        <w:t>// database again. Returns nil, or the error value of the first step that</w:t>
-      </w:r>
-    </w:p>
-    <w:p>
-      <w:pPr>
-        <w:pStyle w:val="SourceCode"/>
-      </w:pPr>
-      <w:r>
-        <w:t>// fails.</w:t>
+        <w:t>// database; returns nil, or the first failed step's error value. Exec also</w:t>
+      </w:r>
+    </w:p>
+    <w:p>
+      <w:pPr>
+        <w:pStyle w:val="SourceCode"/>
+      </w:pPr>
+      <w:r>
+        <w:t>// returns a result, unused here. Remember, _ throws away a value.</w:t>
       </w:r>
     </w:p>
     <w:p>
@@ -11099,7 +11168,10 @@
     </w:p>
     <w:p>
       <w:r>
-        <w:t>Both versions read SPA_DB_PASSWORD, connect to 127.0.0.1:3306 as devuser, create spa_setup_check, print the server version, drop the database, and close the connection, and both refuse to start without the password. The Basic version does it all in main and trusts every step after that. The Production-Minded version connects through connectServer, which the Chapter 4 lessons and project reuse, reports a failed connection with its reason and a failed statement with the server's message, starts clean with DROP DATABASE IF EXISTS, and closes the connection with its cleanup form even after an error.</w:t>
+        <w:t>Both versions read SPA_DB_PASSWORD, connect to 127.0.0.1:3306 as devuser, create spa_setup_check, print the server version, drop the database, and close the connection, and both refuse to start without the password. The Basic version does it all in main and trusts every step after that. The Production-Minded version connects through connectServer, which the Chapter 4 lessons and project reuse, reports a failed connection with its reason and a failed statement with the server's message, starts clean with DRO</w:t>
+      </w:r>
+      <w:r>
+        <w:t>P DATABASE IF EXISTS, and closes the connection with its cleanup form even after an error.</w:t>
       </w:r>
     </w:p>
     <w:p>
@@ -11150,7 +11222,10 @@
     </w:p>
     <w:p>
       <w:r>
-        <w:t>Start with the most direct version: main reads SPA_DB_PASSWORD, connects with mysql.connector.connect, makes a cursor, executes CREATE DATABASE, SELECT VERSION(), and DROP DATABASE, prints a line after each step, and closes the cursor and the connection. Like every Basic version in this lesson, it first checks that SPA_DB_PASSWORD is set, so a missing variable never turns into a failed login or a crash. After that, it trusts every step; the Production-Minded version checks them. Every step is commented, so read the comments as you type it.</w:t>
+        <w:t xml:space="preserve">Start with the most direct version: main reads SPA_DB_PASSWORD, connects with mysql.connector.connect, makes a cursor, executes CREATE DATABASE, SELECT VERSION(), and DROP DATABASE, prints a line after each step, and closes the cursor and the connection. Like every Basic version in this lesson, it first checks that SPA_DB_PASSWORD is set, so a missing variable never turns into a failed login or a crash. After that, it trusts every step; the Production-Minded version checks them. Every step is commented, so </w:t>
+      </w:r>
+      <w:r>
+        <w:t>read the comments as you type it.</w:t>
       </w:r>
     </w:p>
     <w:p>
@@ -12760,7 +12835,10 @@
     </w:p>
     <w:p>
       <w:r>
-        <w:t>Both versions read SPA_DB_PASSWORD, connect to 127.0.0.1:3306 as devuser, create spa_setup_check, print the server version, drop the database, and close the connection, and both refuse to start without the password. The Basic version does it all in main and trusts every step after that. The Production-Minded version connects through connect_server, which the Chapter 4 lessons and project reuse, reports a failed connection with its reason and a failed statement with the server's message, starts clean with DROP DATABASE IF EXISTS, and closes the connection with its cleanup form even after an error.</w:t>
+        <w:t>Both versions read SPA_DB_PASSWORD, connect to 127.0.0.1:3306 as devuser, create spa_setup_check, print the server version, drop the database, and close the connection, and both refuse to start without the password. The Basic version does it all in main and trusts every step after that. The Production-Minded version connects through connect_server, which the Chapter 4 lessons and project reuse, reports a failed connection with its reason and a failed statement with the server's message, starts clean with DR</w:t>
+      </w:r>
+      <w:r>
+        <w:t>OP DATABASE IF EXISTS, and closes the connection with its cleanup form even after an error.</w:t>
       </w:r>
     </w:p>
     <w:p>
@@ -12842,31 +12920,31 @@
         <w:keepNext/>
       </w:pPr>
       <w:r>
-        <w:t>// mysql2 is the MySQL connector package. Remember, package.json pins its</w:t>
-      </w:r>
-    </w:p>
-    <w:p>
-      <w:pPr>
-        <w:pStyle w:val="SourceCode"/>
-      </w:pPr>
-      <w:r>
-        <w:t>// version, and npm installed it into this project only (Lesson 2.17).</w:t>
-      </w:r>
-    </w:p>
-    <w:p>
-      <w:pPr>
-        <w:pStyle w:val="SourceCode"/>
-      </w:pPr>
-      <w:r>
-        <w:t>// mysql2/promise is its form that works with await. RowDataPacket is the</w:t>
-      </w:r>
-    </w:p>
-    <w:p>
-      <w:pPr>
-        <w:pStyle w:val="SourceCode"/>
-      </w:pPr>
-      <w:r>
-        <w:t>// type of one returned row.</w:t>
+        <w:t>// mysql2 is the MySQL connector. Remember, package.json pins it, and npm</w:t>
+      </w:r>
+    </w:p>
+    <w:p>
+      <w:pPr>
+        <w:pStyle w:val="SourceCode"/>
+      </w:pPr>
+      <w:r>
+        <w:t>// installed it into this project only (Lesson 2.17). Without { }, import</w:t>
+      </w:r>
+    </w:p>
+    <w:p>
+      <w:pPr>
+        <w:pStyle w:val="SourceCode"/>
+      </w:pPr>
+      <w:r>
+        <w:t>// mysql names the package's main object mysql; mysql2/promise works with</w:t>
+      </w:r>
+    </w:p>
+    <w:p>
+      <w:pPr>
+        <w:pStyle w:val="SourceCode"/>
+      </w:pPr>
+      <w:r>
+        <w:t>// await. import type brings in only RowDataPacket, one returned row's type.</w:t>
       </w:r>
     </w:p>
     <w:p>
@@ -13142,15 +13220,15 @@
         <w:pStyle w:val="SourceCode"/>
       </w:pPr>
       <w:r>
-        <w:t xml:space="preserve">    // the column. For a SELECT, query returns a pair: answer[0] is the</w:t>
-      </w:r>
-    </w:p>
-    <w:p>
-      <w:pPr>
-        <w:pStyle w:val="SourceCode"/>
-      </w:pPr>
-      <w:r>
-        <w:t xml:space="preserve">    // array of rows, and rows[0].version is the first row's column.</w:t>
+        <w:t xml:space="preserve">    // the column. &lt;RowDataPacket[]&gt; tells TypeScript the rows' type. query</w:t>
+      </w:r>
+    </w:p>
+    <w:p>
+      <w:pPr>
+        <w:pStyle w:val="SourceCode"/>
+      </w:pPr>
+      <w:r>
+        <w:t xml:space="preserve">    // returns a pair: answer[0] is the rows; rows[0].version is the value.</w:t>
       </w:r>
     </w:p>
     <w:p>
@@ -14607,7 +14685,10 @@
     </w:p>
     <w:p>
       <w:r>
-        <w:t>Both versions read SPA_DB_PASSWORD, connect to 127.0.0.1:3306 as devuser, create spa_setup_check, print the server version, drop the database, and close the connection, and both refuse to start without the password. The Basic version does it all in main and trusts every step after that. The Production-Minded version connects through connectServer, which the Chapter 4 lessons and project reuse, reports a failed connection with its reason and a failed statement with the server's message, starts clean with DROP DATABASE IF EXISTS, and closes the connection with its cleanup form even after an error.</w:t>
+        <w:t>Both versions read SPA_DB_PASSWORD, connect to 127.0.0.1:3306 as devuser, create spa_setup_check, print the server version, drop the database, and close the connection, and both refuse to start without the password. The Basic version does it all in main and trusts every step after that. The Production-Minded version connects through connectServer, which the Chapter 4 lessons and project reuse, reports a failed connection with its reason and a failed statement with the server's message, starts clean with DRO</w:t>
+      </w:r>
+      <w:r>
+        <w:t>P DATABASE IF EXISTS, and closes the connection with its cleanup form even after an error.</w:t>
       </w:r>
     </w:p>
     <w:p>
@@ -14635,7 +14716,10 @@
     </w:p>
     <w:p>
       <w:r>
-        <w:t>These are the files the setup commands wrote, shown here so you can check yours. Remember, a project file pins each package to one version, so every learner builds the same thing (Lesson 2.17). Each .csproj names MySqlConnector 2.6.2 in a PackageReference. go.mod names this lesson's Go module, example.com/setupcheck, requires the driver at v1.10.1, and lists filippo.io/edwards25519, a package the driver itself uses, as indirect. package.json names mysql2 3.24.5 under dependencies. Your go line shows your own Go version, your go.mod marks the driver // indirect too, because go get ran before the .go files existed, and the blank lines and the order of the package.json fields may differ.</w:t>
+        <w:t>These are the files the setup commands wrote, shown here so you can check yours. Remember, a project file pins each package to one version, so every learner builds the same thing (Lesson 2.17). Each .csproj names MySqlConnector 2.6.2 in a PackageReference. go.mod names this lesson's Go module, example.com/setupcheck, requires the driver at v1.10.1, and lists filippo.io/edwards25519, a package the driver itself uses, as indirect. package.json names mysql2 3.24.5 under dependencies. Your go line shows your ow</w:t>
+      </w:r>
+      <w:r>
+        <w:t>n Go version, your go.mod marks the driver // indirect too, because go get ran before the .go files existed, and the blank lines and the order of the package.json fields may differ.</w:t>
       </w:r>
     </w:p>
     <w:p>
@@ -15418,7 +15502,10 @@
     </w:p>
     <w:p>
       <w:r>
-        <w:t>The Chapter 4 project, the Database-Backed Contact Manager, keeps its contacts in a MySQL database, spa_contacts, and reaches it through the same connection this lesson sets up: devuser, 127.0.0.1:3306, the password from SPA_DB_PASSWORD, and each language's connector. connect_server (connectServer, ConnectServer) is that piece: it connects as the lesson user and reports a failed connection with its reason, and it connects to the server only, with no database chosen. Lesson 4.2 builds connect_database (connectDatabase, ConnectDatabase) on top of it, which also chooses the database, and every later lesson and the project start from those two functions.</w:t>
+        <w:t>The Chapter 4 project, the Database-Backed Contact Manager, keeps its contacts in a MySQL database, spa_contacts, and reaches it through the same connection this lesson sets up: devuser, 127.0.0.1:3306, the password from SPA_DB_PASSWORD, and each language's connector. connect_server (connectServer, ConnectServer) is that piece: it connects as the lesson user and reports a failed connection with its reason, and it connects to the server only, with no database chosen. Lesson 4.2 builds connect_database (conne</w:t>
+      </w:r>
+      <w:r>
+        <w:t>ctDatabase, ConnectDatabase) on top of it, which also chooses the database, and every later lesson and the project start from those two functions.</w:t>
       </w:r>
     </w:p>
     <w:p>
@@ -15814,7 +15901,10 @@
     </w:p>
     <w:p>
       <w:r>
-        <w:t>MySQL Server runs as a service on this computer and listens on port 3306. root was used once, to create devuser, an account that may use only databases whose names start with spa_; SHOW GRANTS proves it, and CREATE DATABASE spam proves the limit. devuser's password lives in SPA_DB_PASSWORD, never in code, and every program reads it from there. Each language reaches the server through its own connector, installed inside the project and pinned to one version; C and C++ use MySQL's own libraries, with their DLLs next to the programs, and C++ builds with Visual C++ on Windows because its connector is built for it. Every program connected, created spa_setup_check, printed the server's version, and dropped it again, and the Production-Minded versions report a missing password or a failed connection in Lesson 2.11's style and close the connection with Lesson 3.2's cleanup forms. Lesson 4.1 explains what a database holds, and Lesson 4.2 connects to a lesson database by name.</w:t>
+        <w:t>MySQL Server runs as a service on this computer and listens on port 3306. root was used once, to create devuser, an account that may use only databases whose names start with spa_; SHOW GRANTS proves it, and CREATE DATABASE spam proves the limit. devuser's password lives in SPA_DB_PASSWORD, never in code, and every program reads it from there. Each language reaches the server through its own connector, installed inside the project and pinned to one version; C and C++ use MySQL's own libraries, with their DL</w:t>
+      </w:r>
+      <w:r>
+        <w:t>Ls next to the programs, and C++ builds with Visual C++ on Windows because its connector is built for it. Every program connected, created spa_setup_check, printed the server's version, and dropped it again, and the Production-Minded versions report a missing password or a failed connection in Lesson 2.11's style and close the connection with Lesson 3.2's cleanup forms. Lesson 4.1 explains what a database holds, and Lesson 4.2 connects to a lesson database by name.</w:t>
       </w:r>
     </w:p>
     <w:sectPr>
@@ -16000,31 +16090,31 @@
       </w:rPr>
     </w:lvl>
   </w:abstractNum>
-  <w:num w:numId="1" w16cid:durableId="1151870425">
+  <w:num w:numId="1" w16cid:durableId="576550048">
     <w:abstractNumId w:val="8"/>
   </w:num>
-  <w:num w:numId="2" w16cid:durableId="2102723206">
+  <w:num w:numId="2" w16cid:durableId="683358752">
     <w:abstractNumId w:val="6"/>
   </w:num>
-  <w:num w:numId="3" w16cid:durableId="1560438196">
+  <w:num w:numId="3" w16cid:durableId="2118409632">
     <w:abstractNumId w:val="5"/>
   </w:num>
-  <w:num w:numId="4" w16cid:durableId="1790122823">
+  <w:num w:numId="4" w16cid:durableId="253512161">
     <w:abstractNumId w:val="4"/>
   </w:num>
-  <w:num w:numId="5" w16cid:durableId="1266232552">
+  <w:num w:numId="5" w16cid:durableId="698706075">
     <w:abstractNumId w:val="7"/>
   </w:num>
-  <w:num w:numId="6" w16cid:durableId="1468356183">
+  <w:num w:numId="6" w16cid:durableId="1890147900">
     <w:abstractNumId w:val="3"/>
   </w:num>
-  <w:num w:numId="7" w16cid:durableId="1863401498">
+  <w:num w:numId="7" w16cid:durableId="509217759">
     <w:abstractNumId w:val="2"/>
   </w:num>
-  <w:num w:numId="8" w16cid:durableId="516424936">
+  <w:num w:numId="8" w16cid:durableId="1959098352">
     <w:abstractNumId w:val="1"/>
   </w:num>
-  <w:num w:numId="9" w16cid:durableId="29651183">
+  <w:num w:numId="9" w16cid:durableId="1262252279">
     <w:abstractNumId w:val="0"/>
   </w:num>
 </w:numbering>

</xml_diff>